<commit_message>
configurare conexiune cu baza de date. creare baza de date
</commit_message>
<xml_diff>
--- a/Documentatie.docx
+++ b/Documentatie.docx
@@ -247,6 +247,9 @@
       </w:r>
       <w:proofErr w:type="spellEnd"/>
       <w:r>
+        <w:t>, email</w:t>
+      </w:r>
+      <w:r>
         <w:t xml:space="preserve">, </w:t>
       </w:r>
       <w:proofErr w:type="spellStart"/>
@@ -390,13 +393,7 @@
     </w:p>
     <w:p>
       <w:r>
-        <w:t>DELETE</w:t>
-      </w:r>
-      <w:r>
-        <w:t xml:space="preserve"> /v1/functions</w:t>
-      </w:r>
-      <w:r>
-        <w:t>/123</w:t>
+        <w:t>DELETE /v1/functions/123</w:t>
       </w:r>
     </w:p>
     <w:p>
@@ -448,6 +445,18 @@
           <w:t>https://medium.com/@anandjeyaseelan10/rest-api-development-using-spring-boot-step-by-step-7112e3be432b</w:t>
         </w:r>
       </w:hyperlink>
+    </w:p>
+    <w:p>
+      <w:hyperlink r:id="rId9" w:history="1">
+        <w:r>
+          <w:rPr>
+            <w:rStyle w:val="Hyperlink"/>
+          </w:rPr>
+          <w:t>https://medium.com/@AlexanderObregon/using-spring-boot-with-postgresql-for-data-persistence-49e843ab46fc</w:t>
+        </w:r>
+      </w:hyperlink>
+    </w:p>
+    <w:p>
       <w:r>
         <w:br/>
       </w:r>

</xml_diff>

<commit_message>
Tratare exceptii + getById
</commit_message>
<xml_diff>
--- a/Documentatie.docx
+++ b/Documentatie.docx
@@ -17,7 +17,348 @@
       </w:r>
     </w:p>
     <w:p/>
+    <w:sdt>
+      <w:sdtPr>
+        <w:id w:val="1957518568"/>
+        <w:docPartObj>
+          <w:docPartGallery w:val="Table of Contents"/>
+          <w:docPartUnique/>
+        </w:docPartObj>
+      </w:sdtPr>
+      <w:sdtEndPr>
+        <w:rPr>
+          <w:rFonts w:asciiTheme="minorHAnsi" w:eastAsiaTheme="minorHAnsi" w:hAnsiTheme="minorHAnsi" w:cstheme="minorBidi"/>
+          <w:b/>
+          <w:bCs/>
+          <w:noProof/>
+          <w:color w:val="auto"/>
+          <w:kern w:val="2"/>
+          <w:sz w:val="24"/>
+          <w:szCs w:val="24"/>
+          <w14:ligatures w14:val="standardContextual"/>
+        </w:rPr>
+      </w:sdtEndPr>
+      <w:sdtContent>
+        <w:p>
+          <w:pPr>
+            <w:pStyle w:val="TOCHeading"/>
+          </w:pPr>
+          <w:r>
+            <w:t>Contents</w:t>
+          </w:r>
+        </w:p>
+        <w:p>
+          <w:pPr>
+            <w:pStyle w:val="TOC1"/>
+            <w:tabs>
+              <w:tab w:val="right" w:leader="dot" w:pos="9350"/>
+            </w:tabs>
+            <w:rPr>
+              <w:noProof/>
+            </w:rPr>
+          </w:pPr>
+          <w:r>
+            <w:fldChar w:fldCharType="begin"/>
+          </w:r>
+          <w:r>
+            <w:instrText xml:space="preserve"> TOC \o "1-3" \h \z \u </w:instrText>
+          </w:r>
+          <w:r>
+            <w:fldChar w:fldCharType="separate"/>
+          </w:r>
+          <w:hyperlink w:anchor="_Toc234069809" w:history="1">
+            <w:r>
+              <w:rPr>
+                <w:rStyle w:val="Hyperlink"/>
+                <w:noProof/>
+              </w:rPr>
+              <w:t>TODO</w:t>
+            </w:r>
+            <w:r>
+              <w:rPr>
+                <w:noProof/>
+                <w:webHidden/>
+              </w:rPr>
+              <w:tab/>
+            </w:r>
+            <w:r>
+              <w:rPr>
+                <w:noProof/>
+                <w:webHidden/>
+              </w:rPr>
+              <w:fldChar w:fldCharType="begin"/>
+            </w:r>
+            <w:r>
+              <w:rPr>
+                <w:noProof/>
+                <w:webHidden/>
+              </w:rPr>
+              <w:instrText xml:space="preserve"> PAGEREF _Toc234069809 \h </w:instrText>
+            </w:r>
+            <w:r>
+              <w:rPr>
+                <w:noProof/>
+                <w:webHidden/>
+              </w:rPr>
+            </w:r>
+            <w:r>
+              <w:rPr>
+                <w:noProof/>
+                <w:webHidden/>
+              </w:rPr>
+              <w:fldChar w:fldCharType="separate"/>
+            </w:r>
+            <w:r>
+              <w:rPr>
+                <w:noProof/>
+                <w:webHidden/>
+              </w:rPr>
+              <w:t>1</w:t>
+            </w:r>
+            <w:r>
+              <w:rPr>
+                <w:noProof/>
+                <w:webHidden/>
+              </w:rPr>
+              <w:fldChar w:fldCharType="end"/>
+            </w:r>
+          </w:hyperlink>
+        </w:p>
+        <w:p>
+          <w:pPr>
+            <w:pStyle w:val="TOC1"/>
+            <w:tabs>
+              <w:tab w:val="right" w:leader="dot" w:pos="9350"/>
+            </w:tabs>
+            <w:rPr>
+              <w:noProof/>
+            </w:rPr>
+          </w:pPr>
+          <w:hyperlink w:anchor="_Toc234069810" w:history="1">
+            <w:r>
+              <w:rPr>
+                <w:rStyle w:val="Hyperlink"/>
+                <w:noProof/>
+              </w:rPr>
+              <w:t>Endpoint-uri</w:t>
+            </w:r>
+            <w:r>
+              <w:rPr>
+                <w:noProof/>
+                <w:webHidden/>
+              </w:rPr>
+              <w:tab/>
+            </w:r>
+            <w:r>
+              <w:rPr>
+                <w:noProof/>
+                <w:webHidden/>
+              </w:rPr>
+              <w:fldChar w:fldCharType="begin"/>
+            </w:r>
+            <w:r>
+              <w:rPr>
+                <w:noProof/>
+                <w:webHidden/>
+              </w:rPr>
+              <w:instrText xml:space="preserve"> PAGEREF _Toc234069810 \h </w:instrText>
+            </w:r>
+            <w:r>
+              <w:rPr>
+                <w:noProof/>
+                <w:webHidden/>
+              </w:rPr>
+            </w:r>
+            <w:r>
+              <w:rPr>
+                <w:noProof/>
+                <w:webHidden/>
+              </w:rPr>
+              <w:fldChar w:fldCharType="separate"/>
+            </w:r>
+            <w:r>
+              <w:rPr>
+                <w:noProof/>
+                <w:webHidden/>
+              </w:rPr>
+              <w:t>1</w:t>
+            </w:r>
+            <w:r>
+              <w:rPr>
+                <w:noProof/>
+                <w:webHidden/>
+              </w:rPr>
+              <w:fldChar w:fldCharType="end"/>
+            </w:r>
+          </w:hyperlink>
+        </w:p>
+        <w:p>
+          <w:pPr>
+            <w:pStyle w:val="TOC1"/>
+            <w:tabs>
+              <w:tab w:val="right" w:leader="dot" w:pos="9350"/>
+            </w:tabs>
+            <w:rPr>
+              <w:noProof/>
+            </w:rPr>
+          </w:pPr>
+          <w:hyperlink w:anchor="_Toc234069811" w:history="1">
+            <w:r>
+              <w:rPr>
+                <w:rStyle w:val="Hyperlink"/>
+                <w:noProof/>
+              </w:rPr>
+              <w:t>Model baza de date</w:t>
+            </w:r>
+            <w:r>
+              <w:rPr>
+                <w:noProof/>
+                <w:webHidden/>
+              </w:rPr>
+              <w:tab/>
+            </w:r>
+            <w:r>
+              <w:rPr>
+                <w:noProof/>
+                <w:webHidden/>
+              </w:rPr>
+              <w:fldChar w:fldCharType="begin"/>
+            </w:r>
+            <w:r>
+              <w:rPr>
+                <w:noProof/>
+                <w:webHidden/>
+              </w:rPr>
+              <w:instrText xml:space="preserve"> PAGEREF _Toc234069811 \h </w:instrText>
+            </w:r>
+            <w:r>
+              <w:rPr>
+                <w:noProof/>
+                <w:webHidden/>
+              </w:rPr>
+            </w:r>
+            <w:r>
+              <w:rPr>
+                <w:noProof/>
+                <w:webHidden/>
+              </w:rPr>
+              <w:fldChar w:fldCharType="separate"/>
+            </w:r>
+            <w:r>
+              <w:rPr>
+                <w:noProof/>
+                <w:webHidden/>
+              </w:rPr>
+              <w:t>1</w:t>
+            </w:r>
+            <w:r>
+              <w:rPr>
+                <w:noProof/>
+                <w:webHidden/>
+              </w:rPr>
+              <w:fldChar w:fldCharType="end"/>
+            </w:r>
+          </w:hyperlink>
+        </w:p>
+        <w:p>
+          <w:pPr>
+            <w:pStyle w:val="TOC1"/>
+            <w:tabs>
+              <w:tab w:val="right" w:leader="dot" w:pos="9350"/>
+            </w:tabs>
+            <w:rPr>
+              <w:noProof/>
+            </w:rPr>
+          </w:pPr>
+          <w:hyperlink w:anchor="_Toc234069812" w:history="1">
+            <w:r>
+              <w:rPr>
+                <w:rStyle w:val="Hyperlink"/>
+                <w:noProof/>
+              </w:rPr>
+              <w:t>Articole</w:t>
+            </w:r>
+            <w:r>
+              <w:rPr>
+                <w:noProof/>
+                <w:webHidden/>
+              </w:rPr>
+              <w:tab/>
+            </w:r>
+            <w:r>
+              <w:rPr>
+                <w:noProof/>
+                <w:webHidden/>
+              </w:rPr>
+              <w:fldChar w:fldCharType="begin"/>
+            </w:r>
+            <w:r>
+              <w:rPr>
+                <w:noProof/>
+                <w:webHidden/>
+              </w:rPr>
+              <w:instrText xml:space="preserve"> PAGEREF _Toc234069812 \h </w:instrText>
+            </w:r>
+            <w:r>
+              <w:rPr>
+                <w:noProof/>
+                <w:webHidden/>
+              </w:rPr>
+            </w:r>
+            <w:r>
+              <w:rPr>
+                <w:noProof/>
+                <w:webHidden/>
+              </w:rPr>
+              <w:fldChar w:fldCharType="separate"/>
+            </w:r>
+            <w:r>
+              <w:rPr>
+                <w:noProof/>
+                <w:webHidden/>
+              </w:rPr>
+              <w:t>1</w:t>
+            </w:r>
+            <w:r>
+              <w:rPr>
+                <w:noProof/>
+                <w:webHidden/>
+              </w:rPr>
+              <w:fldChar w:fldCharType="end"/>
+            </w:r>
+          </w:hyperlink>
+        </w:p>
+        <w:p>
+          <w:r>
+            <w:rPr>
+              <w:b/>
+              <w:bCs/>
+              <w:noProof/>
+            </w:rPr>
+            <w:fldChar w:fldCharType="end"/>
+          </w:r>
+        </w:p>
+      </w:sdtContent>
+    </w:sdt>
     <w:p>
+      <w:pPr>
+        <w:pStyle w:val="Heading1"/>
+      </w:pPr>
+      <w:bookmarkStart w:id="0" w:name="_Toc234069809"/>
+      <w:r>
+        <w:t>TODO</w:t>
+      </w:r>
+      <w:bookmarkEnd w:id="0"/>
+    </w:p>
+    <w:p/>
+    <w:p>
+      <w:pPr>
+        <w:pStyle w:val="ListParagraph"/>
+        <w:numPr>
+          <w:ilvl w:val="0"/>
+          <w:numId w:val="1"/>
+        </w:numPr>
+      </w:pPr>
       <w:proofErr w:type="spellStart"/>
       <w:r>
         <w:t>Creare</w:t>
@@ -42,7 +383,7 @@
       <w:r>
         <w:t xml:space="preserve"> - </w:t>
       </w:r>
-      <w:hyperlink r:id="rId4" w:history="1">
+      <w:hyperlink r:id="rId6" w:history="1">
         <w:r>
           <w:rPr>
             <w:rStyle w:val="Hyperlink"/>
@@ -52,111 +393,25 @@
       </w:hyperlink>
     </w:p>
     <w:p>
-      <w:r>
-        <w:t xml:space="preserve">Maven - </w:t>
-      </w:r>
-      <w:hyperlink r:id="rId5" w:history="1">
-        <w:r>
-          <w:rPr>
-            <w:rStyle w:val="Hyperlink"/>
-          </w:rPr>
-          <w:t>https://maven.apache.org/</w:t>
-        </w:r>
-      </w:hyperlink>
+      <w:pPr>
+        <w:pStyle w:val="ListParagraph"/>
+        <w:numPr>
+          <w:ilvl w:val="0"/>
+          <w:numId w:val="1"/>
+        </w:numPr>
+      </w:pPr>
+      <w:r>
+        <w:t xml:space="preserve">Spring </w:t>
+      </w:r>
+      <w:proofErr w:type="spellStart"/>
+      <w:r>
+        <w:t>initializr</w:t>
+      </w:r>
+      <w:proofErr w:type="spellEnd"/>
       <w:r>
         <w:t xml:space="preserve"> - </w:t>
       </w:r>
-      <w:proofErr w:type="spellStart"/>
-      <w:r>
-        <w:t>Gestionarea</w:t>
-      </w:r>
-      <w:proofErr w:type="spellEnd"/>
-      <w:r>
-        <w:t xml:space="preserve"> </w:t>
-      </w:r>
-      <w:proofErr w:type="spellStart"/>
-      <w:r>
-        <w:t>depentelor</w:t>
-      </w:r>
-      <w:proofErr w:type="spellEnd"/>
-      <w:r>
-        <w:t xml:space="preserve">, </w:t>
-      </w:r>
-      <w:proofErr w:type="spellStart"/>
-      <w:r>
-        <w:t>compileaza</w:t>
-      </w:r>
-      <w:proofErr w:type="spellEnd"/>
-      <w:r>
-        <w:t xml:space="preserve"> </w:t>
-      </w:r>
-      <w:proofErr w:type="spellStart"/>
-      <w:r>
-        <w:t>codul</w:t>
-      </w:r>
-      <w:proofErr w:type="spellEnd"/>
-      <w:r>
-        <w:t xml:space="preserve">, </w:t>
-      </w:r>
-      <w:proofErr w:type="spellStart"/>
-      <w:r>
-        <w:t>construieste</w:t>
-      </w:r>
-      <w:proofErr w:type="spellEnd"/>
-      <w:r>
-        <w:t xml:space="preserve"> </w:t>
-      </w:r>
-      <w:proofErr w:type="spellStart"/>
-      <w:r>
-        <w:t>aplicatia</w:t>
-      </w:r>
-      <w:proofErr w:type="spellEnd"/>
-      <w:r>
-        <w:t xml:space="preserve"> </w:t>
-      </w:r>
-      <w:proofErr w:type="spellStart"/>
-      <w:r>
-        <w:t>impreuna</w:t>
-      </w:r>
-      <w:proofErr w:type="spellEnd"/>
-      <w:r>
-        <w:t xml:space="preserve"> cu </w:t>
-      </w:r>
-      <w:proofErr w:type="spellStart"/>
-      <w:r>
-        <w:t>toate</w:t>
-      </w:r>
-      <w:proofErr w:type="spellEnd"/>
-      <w:r>
-        <w:t xml:space="preserve"> </w:t>
-      </w:r>
-      <w:proofErr w:type="spellStart"/>
-      <w:r>
-        <w:t>dependentele</w:t>
-      </w:r>
-      <w:proofErr w:type="spellEnd"/>
-      <w:r>
-        <w:t xml:space="preserve">, </w:t>
-      </w:r>
-      <w:proofErr w:type="spellStart"/>
-      <w:r>
-        <w:t>etc</w:t>
-      </w:r>
-      <w:proofErr w:type="spellEnd"/>
-    </w:p>
-    <w:p>
-      <w:r>
-        <w:t xml:space="preserve">Spring </w:t>
-      </w:r>
-      <w:proofErr w:type="spellStart"/>
-      <w:r>
-        <w:t>initializr</w:t>
-      </w:r>
-      <w:proofErr w:type="spellEnd"/>
-      <w:r>
-        <w:t xml:space="preserve"> - </w:t>
-      </w:r>
-      <w:hyperlink r:id="rId6" w:history="1">
+      <w:hyperlink r:id="rId7" w:history="1">
         <w:r>
           <w:rPr>
             <w:rStyle w:val="Hyperlink"/>
@@ -202,138 +457,206 @@
     </w:p>
     <w:p>
       <w:pPr>
-        <w:pStyle w:val="Heading2"/>
-      </w:pPr>
-      <w:r>
-        <w:t xml:space="preserve">Model </w:t>
-      </w:r>
-      <w:proofErr w:type="spellStart"/>
-      <w:r>
-        <w:t>baza</w:t>
-      </w:r>
-      <w:proofErr w:type="spellEnd"/>
-      <w:r>
-        <w:t xml:space="preserve"> de date</w:t>
+        <w:pStyle w:val="ListParagraph"/>
+        <w:numPr>
+          <w:ilvl w:val="0"/>
+          <w:numId w:val="1"/>
+        </w:numPr>
+      </w:pPr>
+      <w:proofErr w:type="spellStart"/>
+      <w:r>
+        <w:t>Utilizare</w:t>
+      </w:r>
+      <w:proofErr w:type="spellEnd"/>
+      <w:r>
+        <w:t xml:space="preserve"> Maven – </w:t>
+      </w:r>
+      <w:proofErr w:type="spellStart"/>
+      <w:r>
+        <w:t>gestioneaza</w:t>
+      </w:r>
+      <w:proofErr w:type="spellEnd"/>
+      <w:r>
+        <w:t xml:space="preserve"> </w:t>
+      </w:r>
+      <w:proofErr w:type="spellStart"/>
+      <w:r>
+        <w:t>dependentele</w:t>
+      </w:r>
+      <w:proofErr w:type="spellEnd"/>
+      <w:r>
+        <w:t xml:space="preserve">, </w:t>
+      </w:r>
+      <w:proofErr w:type="spellStart"/>
+      <w:r>
+        <w:t>compileaza</w:t>
+      </w:r>
+      <w:proofErr w:type="spellEnd"/>
+      <w:r>
+        <w:t xml:space="preserve"> </w:t>
+      </w:r>
+      <w:proofErr w:type="spellStart"/>
+      <w:r>
+        <w:t>si</w:t>
+      </w:r>
+      <w:proofErr w:type="spellEnd"/>
+      <w:r>
+        <w:t xml:space="preserve"> </w:t>
+      </w:r>
+      <w:proofErr w:type="spellStart"/>
+      <w:r>
+        <w:t>construieste</w:t>
+      </w:r>
+      <w:proofErr w:type="spellEnd"/>
+      <w:r>
+        <w:t xml:space="preserve"> </w:t>
+      </w:r>
+      <w:proofErr w:type="spellStart"/>
+      <w:r>
+        <w:t>aplicatia</w:t>
+      </w:r>
+      <w:proofErr w:type="spellEnd"/>
+      <w:r>
+        <w:t>, etc.</w:t>
       </w:r>
     </w:p>
     <w:p>
-      <w:proofErr w:type="spellStart"/>
-      <w:r>
-        <w:t>Angajat</w:t>
-      </w:r>
-      <w:proofErr w:type="spellEnd"/>
-      <w:r>
-        <w:t xml:space="preserve"> (</w:t>
-      </w:r>
-      <w:proofErr w:type="spellStart"/>
-      <w:r>
-        <w:t>id_angajat</w:t>
-      </w:r>
-      <w:proofErr w:type="spellEnd"/>
-      <w:r>
-        <w:t xml:space="preserve">#, </w:t>
-      </w:r>
-      <w:proofErr w:type="spellStart"/>
-      <w:r>
-        <w:t>nume</w:t>
-      </w:r>
-      <w:proofErr w:type="spellEnd"/>
-      <w:r>
-        <w:t xml:space="preserve">, </w:t>
-      </w:r>
-      <w:proofErr w:type="spellStart"/>
-      <w:r>
-        <w:t>prenume</w:t>
-      </w:r>
-      <w:proofErr w:type="spellEnd"/>
-      <w:r>
-        <w:t>, email</w:t>
-      </w:r>
-      <w:r>
-        <w:t xml:space="preserve">, </w:t>
-      </w:r>
-      <w:proofErr w:type="spellStart"/>
-      <w:r>
-        <w:t>data_angajarii</w:t>
-      </w:r>
-      <w:proofErr w:type="spellEnd"/>
-      <w:r>
-        <w:t xml:space="preserve">, </w:t>
-      </w:r>
-      <w:proofErr w:type="spellStart"/>
-      <w:r>
-        <w:t>fk_functie</w:t>
-      </w:r>
-      <w:proofErr w:type="spellEnd"/>
-      <w:r>
-        <w:t>)</w:t>
+      <w:pPr>
+        <w:pStyle w:val="ListParagraph"/>
+        <w:numPr>
+          <w:ilvl w:val="0"/>
+          <w:numId w:val="1"/>
+        </w:numPr>
+      </w:pPr>
+      <w:r>
+        <w:t xml:space="preserve">WARN 26580 --- [e1] [           main] </w:t>
+      </w:r>
+      <w:proofErr w:type="spellStart"/>
+      <w:r>
+        <w:t>JpaBaseConfiguration$</w:t>
+      </w:r>
+      <w:proofErr w:type="gramStart"/>
+      <w:r>
+        <w:t>JpaWebConfiguration</w:t>
+      </w:r>
+      <w:proofErr w:type="spellEnd"/>
+      <w:r>
+        <w:t xml:space="preserve"> :</w:t>
+      </w:r>
+      <w:proofErr w:type="gramEnd"/>
+      <w:r>
+        <w:t xml:space="preserve"> </w:t>
+      </w:r>
+      <w:proofErr w:type="spellStart"/>
+      <w:proofErr w:type="gramStart"/>
+      <w:r>
+        <w:t>spring.jpa.open</w:t>
+      </w:r>
+      <w:proofErr w:type="spellEnd"/>
+      <w:proofErr w:type="gramEnd"/>
+      <w:r>
+        <w:t xml:space="preserve">-in-view is enabled by default. Therefore, database queries may be performed during view rendering. Explicitly configure </w:t>
+      </w:r>
+      <w:proofErr w:type="spellStart"/>
+      <w:proofErr w:type="gramStart"/>
+      <w:r>
+        <w:t>spring.jpa.open</w:t>
+      </w:r>
+      <w:proofErr w:type="spellEnd"/>
+      <w:proofErr w:type="gramEnd"/>
+      <w:r>
+        <w:t>-in-view to disable this warning</w:t>
       </w:r>
     </w:p>
     <w:p>
-      <w:proofErr w:type="spellStart"/>
-      <w:r>
-        <w:t>Functie</w:t>
-      </w:r>
-      <w:proofErr w:type="spellEnd"/>
-      <w:r>
-        <w:t>(</w:t>
-      </w:r>
-      <w:proofErr w:type="spellStart"/>
-      <w:r>
-        <w:t>id_functie</w:t>
-      </w:r>
-      <w:proofErr w:type="spellEnd"/>
-      <w:r>
-        <w:t xml:space="preserve">#, </w:t>
-      </w:r>
-      <w:proofErr w:type="spellStart"/>
-      <w:r>
-        <w:t>denumire</w:t>
-      </w:r>
-      <w:proofErr w:type="spellEnd"/>
-      <w:r>
-        <w:t>)</w:t>
+      <w:pPr>
+        <w:pStyle w:val="ListParagraph"/>
+        <w:numPr>
+          <w:ilvl w:val="0"/>
+          <w:numId w:val="1"/>
+        </w:numPr>
+      </w:pPr>
+      <w:r>
+        <w:t>201 Created: New resource created successfully</w:t>
       </w:r>
     </w:p>
     <w:p>
       <w:pPr>
-        <w:pStyle w:val="Heading2"/>
-      </w:pPr>
-      <w:proofErr w:type="spellStart"/>
-      <w:r>
-        <w:t>Cazuri</w:t>
-      </w:r>
-      <w:proofErr w:type="spellEnd"/>
-      <w:r>
-        <w:t xml:space="preserve"> de </w:t>
-      </w:r>
-      <w:proofErr w:type="spellStart"/>
-      <w:r>
-        <w:t>utilizare</w:t>
-      </w:r>
-      <w:proofErr w:type="spellEnd"/>
+        <w:pStyle w:val="ListParagraph"/>
+        <w:numPr>
+          <w:ilvl w:val="0"/>
+          <w:numId w:val="1"/>
+        </w:numPr>
+      </w:pPr>
+      <w:r>
+        <w:t>400 Bad Request: Invalid request format or parameters</w:t>
+      </w:r>
     </w:p>
     <w:p>
-      <w:proofErr w:type="spellStart"/>
-      <w:r>
-        <w:t>Creare</w:t>
-      </w:r>
-      <w:proofErr w:type="spellEnd"/>
-      <w:r>
-        <w:t xml:space="preserve"> </w:t>
-      </w:r>
-      <w:proofErr w:type="spellStart"/>
-      <w:r>
-        <w:t>functie</w:t>
-      </w:r>
+      <w:pPr>
+        <w:pStyle w:val="Heading1"/>
+      </w:pPr>
+      <w:bookmarkStart w:id="1" w:name="_Toc234069810"/>
+      <w:r>
+        <w:t>Endpoint-</w:t>
+      </w:r>
+      <w:proofErr w:type="spellStart"/>
+      <w:r>
+        <w:t>uri</w:t>
+      </w:r>
+      <w:bookmarkEnd w:id="1"/>
       <w:proofErr w:type="spellEnd"/>
     </w:p>
     <w:p>
-      <w:r>
-        <w:t xml:space="preserve"> POST /v1/functions</w:t>
-      </w:r>
+      <w:pPr>
+        <w:pStyle w:val="ListParagraph"/>
+        <w:numPr>
+          <w:ilvl w:val="0"/>
+          <w:numId w:val="4"/>
+        </w:numPr>
+      </w:pPr>
+      <w:r>
+        <w:t>POST /v1/functions</w:t>
+      </w:r>
+      <w:r>
+        <w:t xml:space="preserve"> </w:t>
+      </w:r>
+      <w:proofErr w:type="spellStart"/>
+      <w:r>
+        <w:t>Creare</w:t>
+      </w:r>
+      <w:proofErr w:type="spellEnd"/>
+      <w:r>
+        <w:t xml:space="preserve"> </w:t>
+      </w:r>
+      <w:proofErr w:type="spellStart"/>
+      <w:r>
+        <w:t>functie</w:t>
+      </w:r>
+      <w:proofErr w:type="spellEnd"/>
+      <w:r>
+        <w:t xml:space="preserve"> </w:t>
+      </w:r>
+      <w:proofErr w:type="spellStart"/>
+      <w:r>
+        <w:t>angajat</w:t>
+      </w:r>
+      <w:proofErr w:type="spellEnd"/>
     </w:p>
     <w:p>
+      <w:pPr>
+        <w:pStyle w:val="ListParagraph"/>
+        <w:numPr>
+          <w:ilvl w:val="0"/>
+          <w:numId w:val="4"/>
+        </w:numPr>
+      </w:pPr>
+      <w:r>
+        <w:t>POST /v1/employees</w:t>
+      </w:r>
+      <w:r>
+        <w:t xml:space="preserve"> </w:t>
+      </w:r>
       <w:proofErr w:type="spellStart"/>
       <w:r>
         <w:t>Creare</w:t>
@@ -344,126 +667,289 @@
       </w:r>
       <w:proofErr w:type="spellStart"/>
       <w:r>
-        <w:t>Angajat</w:t>
+        <w:t>angajat</w:t>
       </w:r>
       <w:proofErr w:type="spellEnd"/>
     </w:p>
     <w:p>
-      <w:r>
-        <w:t>POST /v1/</w:t>
-      </w:r>
-      <w:r>
-        <w:t>employees</w:t>
-      </w:r>
+      <w:pPr>
+        <w:pStyle w:val="Heading1"/>
+      </w:pPr>
+      <w:bookmarkStart w:id="2" w:name="_Toc234069811"/>
+      <w:r>
+        <w:t xml:space="preserve">Model </w:t>
+      </w:r>
+      <w:proofErr w:type="spellStart"/>
+      <w:r>
+        <w:t>baza</w:t>
+      </w:r>
+      <w:proofErr w:type="spellEnd"/>
+      <w:r>
+        <w:t xml:space="preserve"> de date</w:t>
+      </w:r>
+      <w:bookmarkEnd w:id="2"/>
     </w:p>
     <w:p>
-      <w:proofErr w:type="spellStart"/>
-      <w:r>
-        <w:t>Stergere</w:t>
-      </w:r>
-      <w:proofErr w:type="spellEnd"/>
-      <w:r>
-        <w:t xml:space="preserve"> </w:t>
-      </w:r>
+      <w:pPr>
+        <w:pStyle w:val="ListParagraph"/>
+        <w:numPr>
+          <w:ilvl w:val="0"/>
+          <w:numId w:val="3"/>
+        </w:numPr>
+      </w:pPr>
       <w:proofErr w:type="spellStart"/>
       <w:r>
         <w:t>Angajat</w:t>
       </w:r>
       <w:proofErr w:type="spellEnd"/>
+      <w:r>
+        <w:t xml:space="preserve"> (</w:t>
+      </w:r>
+      <w:proofErr w:type="spellStart"/>
+      <w:r>
+        <w:t>id_angajat</w:t>
+      </w:r>
+      <w:proofErr w:type="spellEnd"/>
+      <w:r>
+        <w:t xml:space="preserve">#, </w:t>
+      </w:r>
+      <w:proofErr w:type="spellStart"/>
+      <w:r>
+        <w:t>nume</w:t>
+      </w:r>
+      <w:proofErr w:type="spellEnd"/>
+      <w:r>
+        <w:t xml:space="preserve">, </w:t>
+      </w:r>
+      <w:proofErr w:type="spellStart"/>
+      <w:r>
+        <w:t>prenume</w:t>
+      </w:r>
+      <w:proofErr w:type="spellEnd"/>
+      <w:r>
+        <w:t xml:space="preserve">, email, </w:t>
+      </w:r>
+      <w:proofErr w:type="spellStart"/>
+      <w:r>
+        <w:t>data_angajarii</w:t>
+      </w:r>
+      <w:proofErr w:type="spellEnd"/>
+      <w:r>
+        <w:t xml:space="preserve">, </w:t>
+      </w:r>
+      <w:proofErr w:type="spellStart"/>
+      <w:r>
+        <w:t>fk_functie</w:t>
+      </w:r>
+      <w:proofErr w:type="spellEnd"/>
+      <w:r>
+        <w:t>)</w:t>
+      </w:r>
     </w:p>
     <w:p>
-      <w:r>
-        <w:t>DELETE /v1/employees/123</w:t>
+      <w:pPr>
+        <w:pStyle w:val="ListParagraph"/>
+        <w:numPr>
+          <w:ilvl w:val="0"/>
+          <w:numId w:val="3"/>
+        </w:numPr>
+      </w:pPr>
+      <w:proofErr w:type="spellStart"/>
+      <w:proofErr w:type="gramStart"/>
+      <w:r>
+        <w:t>Functie</w:t>
+      </w:r>
+      <w:proofErr w:type="spellEnd"/>
+      <w:r>
+        <w:t>(</w:t>
+      </w:r>
+      <w:proofErr w:type="spellStart"/>
+      <w:proofErr w:type="gramEnd"/>
+      <w:r>
+        <w:t>id_functie</w:t>
+      </w:r>
+      <w:proofErr w:type="spellEnd"/>
+      <w:r>
+        <w:t xml:space="preserve">#, </w:t>
+      </w:r>
+      <w:proofErr w:type="spellStart"/>
+      <w:r>
+        <w:t>denumire</w:t>
+      </w:r>
+      <w:proofErr w:type="spellEnd"/>
+      <w:r>
+        <w:t>)</w:t>
       </w:r>
     </w:p>
     <w:p>
-      <w:proofErr w:type="spellStart"/>
-      <w:r>
-        <w:t>Stergere</w:t>
-      </w:r>
-      <w:proofErr w:type="spellEnd"/>
-      <w:r>
-        <w:t xml:space="preserve"> </w:t>
-      </w:r>
-      <w:proofErr w:type="spellStart"/>
-      <w:r>
-        <w:t>Functie</w:t>
-      </w:r>
+      <w:pPr>
+        <w:pStyle w:val="Heading1"/>
+      </w:pPr>
+      <w:bookmarkStart w:id="3" w:name="_Toc234069812"/>
+      <w:proofErr w:type="spellStart"/>
+      <w:r>
+        <w:lastRenderedPageBreak/>
+        <w:t>Articole</w:t>
+      </w:r>
+      <w:bookmarkEnd w:id="3"/>
       <w:proofErr w:type="spellEnd"/>
     </w:p>
     <w:p>
-      <w:r>
-        <w:t>DELETE /v1/functions/123</w:t>
+      <w:pPr>
+        <w:pStyle w:val="ListParagraph"/>
+        <w:numPr>
+          <w:ilvl w:val="0"/>
+          <w:numId w:val="2"/>
+        </w:numPr>
+      </w:pPr>
+      <w:r>
+        <w:t>https://blog.postman.com/rest-api-best-practices/</w:t>
       </w:r>
     </w:p>
     <w:p>
-      <w:proofErr w:type="spellStart"/>
-      <w:r>
-        <w:t>Editare</w:t>
-      </w:r>
-      <w:proofErr w:type="spellEnd"/>
-      <w:r>
-        <w:t xml:space="preserve"> </w:t>
-      </w:r>
-      <w:proofErr w:type="spellStart"/>
-      <w:r>
-        <w:t>Angajat</w:t>
-      </w:r>
-      <w:proofErr w:type="spellEnd"/>
+      <w:pPr>
+        <w:pStyle w:val="ListParagraph"/>
+        <w:numPr>
+          <w:ilvl w:val="0"/>
+          <w:numId w:val="2"/>
+        </w:numPr>
+      </w:pPr>
+      <w:r>
+        <w:t>https://medium.com/@anandjeyaseelan10/rest-api-development-using-spring-boot-step-by-step-7112e3be432b</w:t>
+      </w:r>
     </w:p>
     <w:p>
-      <w:r>
-        <w:t>PUT /v1/employees/123</w:t>
+      <w:pPr>
+        <w:pStyle w:val="ListParagraph"/>
+        <w:numPr>
+          <w:ilvl w:val="0"/>
+          <w:numId w:val="2"/>
+        </w:numPr>
+      </w:pPr>
+      <w:r>
+        <w:t>https://medium.com/@AlexanderObregon/using-spring-boot-with-postgresql-for-data-persistence-49e843ab46fc</w:t>
       </w:r>
     </w:p>
     <w:p>
       <w:pPr>
-        <w:pStyle w:val="Heading2"/>
-      </w:pPr>
-      <w:proofErr w:type="spellStart"/>
-      <w:r>
-        <w:t>Articole</w:t>
-      </w:r>
-      <w:proofErr w:type="spellEnd"/>
+        <w:pStyle w:val="ListParagraph"/>
+        <w:numPr>
+          <w:ilvl w:val="0"/>
+          <w:numId w:val="2"/>
+        </w:numPr>
+      </w:pPr>
+      <w:r>
+        <w:t>https://www.iso.org/iso-8601-date-and-time-format.html</w:t>
+      </w:r>
     </w:p>
     <w:p>
-      <w:hyperlink r:id="rId7" w:history="1">
-        <w:r>
-          <w:rPr>
-            <w:rStyle w:val="Hyperlink"/>
-          </w:rPr>
-          <w:t>https://blog.postman.com/rest-api-best-practices/</w:t>
-        </w:r>
-      </w:hyperlink>
+      <w:pPr>
+        <w:pStyle w:val="ListParagraph"/>
+        <w:numPr>
+          <w:ilvl w:val="0"/>
+          <w:numId w:val="2"/>
+        </w:numPr>
+      </w:pPr>
+      <w:r>
+        <w:t>http://w3schools.com/sql/sql_foreignkey.asp</w:t>
+      </w:r>
     </w:p>
     <w:p>
+      <w:pPr>
+        <w:pStyle w:val="ListParagraph"/>
+        <w:numPr>
+          <w:ilvl w:val="0"/>
+          <w:numId w:val="2"/>
+        </w:numPr>
+      </w:pPr>
+      <w:r>
+        <w:t>https://www.postgresql.org/docs/current/sql-createsequence.html</w:t>
+      </w:r>
+    </w:p>
+    <w:p>
+      <w:pPr>
+        <w:pStyle w:val="ListParagraph"/>
+        <w:numPr>
+          <w:ilvl w:val="0"/>
+          <w:numId w:val="2"/>
+        </w:numPr>
+      </w:pPr>
+      <w:r>
+        <w:t>https://www.baeldung.com/spring-jpa-sequence-nextval</w:t>
+      </w:r>
+    </w:p>
+    <w:p>
+      <w:pPr>
+        <w:pStyle w:val="ListParagraph"/>
+        <w:numPr>
+          <w:ilvl w:val="0"/>
+          <w:numId w:val="2"/>
+        </w:numPr>
+      </w:pPr>
       <w:hyperlink r:id="rId8" w:history="1">
         <w:r>
           <w:rPr>
             <w:rStyle w:val="Hyperlink"/>
           </w:rPr>
-          <w:t>https://medium.com/@anandjeyaseelan10/rest-api-development-using-spring-boot-step-by-step-7112e3be432b</w:t>
+          <w:t>https://www.baeldu</w:t>
+        </w:r>
+        <w:r>
+          <w:rPr>
+            <w:rStyle w:val="Hyperlink"/>
+          </w:rPr>
+          <w:t>n</w:t>
+        </w:r>
+        <w:r>
+          <w:rPr>
+            <w:rStyle w:val="Hyperlink"/>
+          </w:rPr>
+          <w:t>g.com/java-validation</w:t>
         </w:r>
       </w:hyperlink>
     </w:p>
     <w:p>
+      <w:pPr>
+        <w:pStyle w:val="ListParagraph"/>
+        <w:numPr>
+          <w:ilvl w:val="0"/>
+          <w:numId w:val="2"/>
+        </w:numPr>
+      </w:pPr>
       <w:hyperlink r:id="rId9" w:history="1">
         <w:r>
           <w:rPr>
             <w:rStyle w:val="Hyperlink"/>
           </w:rPr>
-          <w:t>https://medium.com/@AlexanderObregon/using-spring-boot-with-postgresql-for-data-persistence-49e843ab46fc</w:t>
+          <w:t>https://www.baeldung.com/exception-handling-for-rest-with-spring</w:t>
         </w:r>
       </w:hyperlink>
     </w:p>
     <w:p>
-      <w:r>
-        <w:br/>
-      </w:r>
+      <w:pPr>
+        <w:pStyle w:val="ListParagraph"/>
+        <w:numPr>
+          <w:ilvl w:val="0"/>
+          <w:numId w:val="2"/>
+        </w:numPr>
+      </w:pPr>
+      <w:hyperlink r:id="rId10" w:history="1">
+        <w:r>
+          <w:rPr>
+            <w:rStyle w:val="Hyperlink"/>
+          </w:rPr>
+          <w:t>https://www.baeldung.com/spring-boot-return-errors-problemdetail</w:t>
+        </w:r>
+      </w:hyperlink>
     </w:p>
-    <w:p/>
-    <w:p/>
-    <w:p/>
+    <w:p>
+      <w:pPr>
+        <w:pStyle w:val="ListParagraph"/>
+        <w:numPr>
+          <w:ilvl w:val="0"/>
+          <w:numId w:val="2"/>
+        </w:numPr>
+      </w:pPr>
+    </w:p>
     <w:sectPr>
       <w:pgSz w:w="12240" w:h="15840"/>
       <w:pgMar w:top="1440" w:right="1440" w:bottom="1440" w:left="1440" w:header="720" w:footer="720" w:gutter="0"/>
@@ -472,6 +958,475 @@
     </w:sectPr>
   </w:body>
 </w:document>
+</file>
+
+<file path=word/numbering.xml><?xml version="1.0" encoding="utf-8"?>
+<w:numbering xmlns:wpc="http://schemas.microsoft.com/office/word/2010/wordprocessingCanvas" xmlns:cx="http://schemas.microsoft.com/office/drawing/2014/chartex" xmlns:cx1="http://schemas.microsoft.com/office/drawing/2015/9/8/chartex" xmlns:cx2="http://schemas.microsoft.com/office/drawing/2015/10/21/chartex" xmlns:cx3="http://schemas.microsoft.com/office/drawing/2016/5/9/chartex" xmlns:cx4="http://schemas.microsoft.com/office/drawing/2016/5/10/chartex" xmlns:cx5="http://schemas.microsoft.com/office/drawing/2016/5/11/chartex" xmlns:cx6="http://schemas.microsoft.com/office/drawing/2016/5/12/chartex" xmlns:cx7="http://schemas.microsoft.com/office/drawing/2016/5/13/chartex" xmlns:cx8="http://schemas.microsoft.com/office/drawing/2016/5/14/chartex" xmlns:mc="http://schemas.openxmlformats.org/markup-compatibility/2006" xmlns:aink="http://schemas.microsoft.com/office/drawing/2016/ink" xmlns:am3d="http://schemas.microsoft.com/office/drawing/2017/model3d" xmlns:o="urn:schemas-microsoft-com:office:office" xmlns:oel="http://schemas.microsoft.com/office/2019/extlst" xmlns:r="http://schemas.openxmlformats.org/officeDocument/2006/relationships" xmlns:m="http://schemas.openxmlformats.org/officeDocument/2006/math" xmlns:v="urn:schemas-microsoft-com:vml" xmlns:wp14="http://schemas.microsoft.com/office/word/2010/wordprocessingDrawing" xmlns:wp="http://schemas.openxmlformats.org/drawingml/2006/wordprocessingDrawing" xmlns:w10="urn:schemas-microsoft-com:office:word" xmlns:w="http://schemas.openxmlformats.org/wordprocessingml/2006/main" xmlns:w14="http://schemas.microsoft.com/office/word/2010/wordml" xmlns:w15="http://schemas.microsoft.com/office/word/2012/wordml" xmlns:w16cex="http://schemas.microsoft.com/office/word/2018/wordml/cex" xmlns:w16cid="http://schemas.microsoft.com/office/word/2016/wordml/cid" xmlns:w16="http://schemas.microsoft.com/office/word/2018/wordml" xmlns:w16du="http://schemas.microsoft.com/office/word/2023/wordml/word16du" xmlns:w16sdtdh="http://schemas.microsoft.com/office/word/2020/wordml/sdtdatahash" xmlns:w16sdtfl="http://schemas.microsoft.com/office/word/2024/wordml/sdtformatlock" xmlns:w16se="http://schemas.microsoft.com/office/word/2015/wordml/symex" xmlns:wpg="http://schemas.microsoft.com/office/word/2010/wordprocessingGroup" xmlns:wpi="http://schemas.microsoft.com/office/word/2010/wordprocessingInk" xmlns:wne="http://schemas.microsoft.com/office/word/2006/wordml" xmlns:wps="http://schemas.microsoft.com/office/word/2010/wordprocessingShape" mc:Ignorable="w14 w15 w16se w16cid w16 w16cex w16sdtdh w16sdtfl w16du wp14">
+  <w:abstractNum w:abstractNumId="0" w15:restartNumberingAfterBreak="0">
+    <w:nsid w:val="0C3C0ED0"/>
+    <w:multiLevelType w:val="hybridMultilevel"/>
+    <w:tmpl w:val="C6FEA382"/>
+    <w:lvl w:ilvl="0" w:tplc="04090001">
+      <w:start w:val="1"/>
+      <w:numFmt w:val="bullet"/>
+      <w:lvlText w:val=""/>
+      <w:lvlJc w:val="left"/>
+      <w:pPr>
+        <w:ind w:left="720" w:hanging="360"/>
+      </w:pPr>
+      <w:rPr>
+        <w:rFonts w:ascii="Symbol" w:hAnsi="Symbol" w:hint="default"/>
+      </w:rPr>
+    </w:lvl>
+    <w:lvl w:ilvl="1" w:tplc="04090003" w:tentative="1">
+      <w:start w:val="1"/>
+      <w:numFmt w:val="bullet"/>
+      <w:lvlText w:val="o"/>
+      <w:lvlJc w:val="left"/>
+      <w:pPr>
+        <w:ind w:left="1440" w:hanging="360"/>
+      </w:pPr>
+      <w:rPr>
+        <w:rFonts w:ascii="Courier New" w:hAnsi="Courier New" w:cs="Courier New" w:hint="default"/>
+      </w:rPr>
+    </w:lvl>
+    <w:lvl w:ilvl="2" w:tplc="04090005" w:tentative="1">
+      <w:start w:val="1"/>
+      <w:numFmt w:val="bullet"/>
+      <w:lvlText w:val=""/>
+      <w:lvlJc w:val="left"/>
+      <w:pPr>
+        <w:ind w:left="2160" w:hanging="360"/>
+      </w:pPr>
+      <w:rPr>
+        <w:rFonts w:ascii="Wingdings" w:hAnsi="Wingdings" w:hint="default"/>
+      </w:rPr>
+    </w:lvl>
+    <w:lvl w:ilvl="3" w:tplc="04090001" w:tentative="1">
+      <w:start w:val="1"/>
+      <w:numFmt w:val="bullet"/>
+      <w:lvlText w:val=""/>
+      <w:lvlJc w:val="left"/>
+      <w:pPr>
+        <w:ind w:left="2880" w:hanging="360"/>
+      </w:pPr>
+      <w:rPr>
+        <w:rFonts w:ascii="Symbol" w:hAnsi="Symbol" w:hint="default"/>
+      </w:rPr>
+    </w:lvl>
+    <w:lvl w:ilvl="4" w:tplc="04090003" w:tentative="1">
+      <w:start w:val="1"/>
+      <w:numFmt w:val="bullet"/>
+      <w:lvlText w:val="o"/>
+      <w:lvlJc w:val="left"/>
+      <w:pPr>
+        <w:ind w:left="3600" w:hanging="360"/>
+      </w:pPr>
+      <w:rPr>
+        <w:rFonts w:ascii="Courier New" w:hAnsi="Courier New" w:cs="Courier New" w:hint="default"/>
+      </w:rPr>
+    </w:lvl>
+    <w:lvl w:ilvl="5" w:tplc="04090005" w:tentative="1">
+      <w:start w:val="1"/>
+      <w:numFmt w:val="bullet"/>
+      <w:lvlText w:val=""/>
+      <w:lvlJc w:val="left"/>
+      <w:pPr>
+        <w:ind w:left="4320" w:hanging="360"/>
+      </w:pPr>
+      <w:rPr>
+        <w:rFonts w:ascii="Wingdings" w:hAnsi="Wingdings" w:hint="default"/>
+      </w:rPr>
+    </w:lvl>
+    <w:lvl w:ilvl="6" w:tplc="04090001" w:tentative="1">
+      <w:start w:val="1"/>
+      <w:numFmt w:val="bullet"/>
+      <w:lvlText w:val=""/>
+      <w:lvlJc w:val="left"/>
+      <w:pPr>
+        <w:ind w:left="5040" w:hanging="360"/>
+      </w:pPr>
+      <w:rPr>
+        <w:rFonts w:ascii="Symbol" w:hAnsi="Symbol" w:hint="default"/>
+      </w:rPr>
+    </w:lvl>
+    <w:lvl w:ilvl="7" w:tplc="04090003" w:tentative="1">
+      <w:start w:val="1"/>
+      <w:numFmt w:val="bullet"/>
+      <w:lvlText w:val="o"/>
+      <w:lvlJc w:val="left"/>
+      <w:pPr>
+        <w:ind w:left="5760" w:hanging="360"/>
+      </w:pPr>
+      <w:rPr>
+        <w:rFonts w:ascii="Courier New" w:hAnsi="Courier New" w:cs="Courier New" w:hint="default"/>
+      </w:rPr>
+    </w:lvl>
+    <w:lvl w:ilvl="8" w:tplc="04090005" w:tentative="1">
+      <w:start w:val="1"/>
+      <w:numFmt w:val="bullet"/>
+      <w:lvlText w:val=""/>
+      <w:lvlJc w:val="left"/>
+      <w:pPr>
+        <w:ind w:left="6480" w:hanging="360"/>
+      </w:pPr>
+      <w:rPr>
+        <w:rFonts w:ascii="Wingdings" w:hAnsi="Wingdings" w:hint="default"/>
+      </w:rPr>
+    </w:lvl>
+  </w:abstractNum>
+  <w:abstractNum w:abstractNumId="1" w15:restartNumberingAfterBreak="0">
+    <w:nsid w:val="1CC32155"/>
+    <w:multiLevelType w:val="hybridMultilevel"/>
+    <w:tmpl w:val="C43851F8"/>
+    <w:lvl w:ilvl="0" w:tplc="04090001">
+      <w:start w:val="1"/>
+      <w:numFmt w:val="bullet"/>
+      <w:lvlText w:val=""/>
+      <w:lvlJc w:val="left"/>
+      <w:pPr>
+        <w:ind w:left="720" w:hanging="360"/>
+      </w:pPr>
+      <w:rPr>
+        <w:rFonts w:ascii="Symbol" w:hAnsi="Symbol" w:hint="default"/>
+      </w:rPr>
+    </w:lvl>
+    <w:lvl w:ilvl="1" w:tplc="04090003" w:tentative="1">
+      <w:start w:val="1"/>
+      <w:numFmt w:val="bullet"/>
+      <w:lvlText w:val="o"/>
+      <w:lvlJc w:val="left"/>
+      <w:pPr>
+        <w:ind w:left="1440" w:hanging="360"/>
+      </w:pPr>
+      <w:rPr>
+        <w:rFonts w:ascii="Courier New" w:hAnsi="Courier New" w:cs="Courier New" w:hint="default"/>
+      </w:rPr>
+    </w:lvl>
+    <w:lvl w:ilvl="2" w:tplc="04090005" w:tentative="1">
+      <w:start w:val="1"/>
+      <w:numFmt w:val="bullet"/>
+      <w:lvlText w:val=""/>
+      <w:lvlJc w:val="left"/>
+      <w:pPr>
+        <w:ind w:left="2160" w:hanging="360"/>
+      </w:pPr>
+      <w:rPr>
+        <w:rFonts w:ascii="Wingdings" w:hAnsi="Wingdings" w:hint="default"/>
+      </w:rPr>
+    </w:lvl>
+    <w:lvl w:ilvl="3" w:tplc="04090001" w:tentative="1">
+      <w:start w:val="1"/>
+      <w:numFmt w:val="bullet"/>
+      <w:lvlText w:val=""/>
+      <w:lvlJc w:val="left"/>
+      <w:pPr>
+        <w:ind w:left="2880" w:hanging="360"/>
+      </w:pPr>
+      <w:rPr>
+        <w:rFonts w:ascii="Symbol" w:hAnsi="Symbol" w:hint="default"/>
+      </w:rPr>
+    </w:lvl>
+    <w:lvl w:ilvl="4" w:tplc="04090003" w:tentative="1">
+      <w:start w:val="1"/>
+      <w:numFmt w:val="bullet"/>
+      <w:lvlText w:val="o"/>
+      <w:lvlJc w:val="left"/>
+      <w:pPr>
+        <w:ind w:left="3600" w:hanging="360"/>
+      </w:pPr>
+      <w:rPr>
+        <w:rFonts w:ascii="Courier New" w:hAnsi="Courier New" w:cs="Courier New" w:hint="default"/>
+      </w:rPr>
+    </w:lvl>
+    <w:lvl w:ilvl="5" w:tplc="04090005" w:tentative="1">
+      <w:start w:val="1"/>
+      <w:numFmt w:val="bullet"/>
+      <w:lvlText w:val=""/>
+      <w:lvlJc w:val="left"/>
+      <w:pPr>
+        <w:ind w:left="4320" w:hanging="360"/>
+      </w:pPr>
+      <w:rPr>
+        <w:rFonts w:ascii="Wingdings" w:hAnsi="Wingdings" w:hint="default"/>
+      </w:rPr>
+    </w:lvl>
+    <w:lvl w:ilvl="6" w:tplc="04090001" w:tentative="1">
+      <w:start w:val="1"/>
+      <w:numFmt w:val="bullet"/>
+      <w:lvlText w:val=""/>
+      <w:lvlJc w:val="left"/>
+      <w:pPr>
+        <w:ind w:left="5040" w:hanging="360"/>
+      </w:pPr>
+      <w:rPr>
+        <w:rFonts w:ascii="Symbol" w:hAnsi="Symbol" w:hint="default"/>
+      </w:rPr>
+    </w:lvl>
+    <w:lvl w:ilvl="7" w:tplc="04090003" w:tentative="1">
+      <w:start w:val="1"/>
+      <w:numFmt w:val="bullet"/>
+      <w:lvlText w:val="o"/>
+      <w:lvlJc w:val="left"/>
+      <w:pPr>
+        <w:ind w:left="5760" w:hanging="360"/>
+      </w:pPr>
+      <w:rPr>
+        <w:rFonts w:ascii="Courier New" w:hAnsi="Courier New" w:cs="Courier New" w:hint="default"/>
+      </w:rPr>
+    </w:lvl>
+    <w:lvl w:ilvl="8" w:tplc="04090005" w:tentative="1">
+      <w:start w:val="1"/>
+      <w:numFmt w:val="bullet"/>
+      <w:lvlText w:val=""/>
+      <w:lvlJc w:val="left"/>
+      <w:pPr>
+        <w:ind w:left="6480" w:hanging="360"/>
+      </w:pPr>
+      <w:rPr>
+        <w:rFonts w:ascii="Wingdings" w:hAnsi="Wingdings" w:hint="default"/>
+      </w:rPr>
+    </w:lvl>
+  </w:abstractNum>
+  <w:abstractNum w:abstractNumId="2" w15:restartNumberingAfterBreak="0">
+    <w:nsid w:val="559916DF"/>
+    <w:multiLevelType w:val="hybridMultilevel"/>
+    <w:tmpl w:val="4A923204"/>
+    <w:lvl w:ilvl="0" w:tplc="04090001">
+      <w:start w:val="1"/>
+      <w:numFmt w:val="bullet"/>
+      <w:lvlText w:val=""/>
+      <w:lvlJc w:val="left"/>
+      <w:pPr>
+        <w:ind w:left="720" w:hanging="360"/>
+      </w:pPr>
+      <w:rPr>
+        <w:rFonts w:ascii="Symbol" w:hAnsi="Symbol" w:hint="default"/>
+      </w:rPr>
+    </w:lvl>
+    <w:lvl w:ilvl="1" w:tplc="04090003" w:tentative="1">
+      <w:start w:val="1"/>
+      <w:numFmt w:val="bullet"/>
+      <w:lvlText w:val="o"/>
+      <w:lvlJc w:val="left"/>
+      <w:pPr>
+        <w:ind w:left="1440" w:hanging="360"/>
+      </w:pPr>
+      <w:rPr>
+        <w:rFonts w:ascii="Courier New" w:hAnsi="Courier New" w:cs="Courier New" w:hint="default"/>
+      </w:rPr>
+    </w:lvl>
+    <w:lvl w:ilvl="2" w:tplc="04090005" w:tentative="1">
+      <w:start w:val="1"/>
+      <w:numFmt w:val="bullet"/>
+      <w:lvlText w:val=""/>
+      <w:lvlJc w:val="left"/>
+      <w:pPr>
+        <w:ind w:left="2160" w:hanging="360"/>
+      </w:pPr>
+      <w:rPr>
+        <w:rFonts w:ascii="Wingdings" w:hAnsi="Wingdings" w:hint="default"/>
+      </w:rPr>
+    </w:lvl>
+    <w:lvl w:ilvl="3" w:tplc="04090001" w:tentative="1">
+      <w:start w:val="1"/>
+      <w:numFmt w:val="bullet"/>
+      <w:lvlText w:val=""/>
+      <w:lvlJc w:val="left"/>
+      <w:pPr>
+        <w:ind w:left="2880" w:hanging="360"/>
+      </w:pPr>
+      <w:rPr>
+        <w:rFonts w:ascii="Symbol" w:hAnsi="Symbol" w:hint="default"/>
+      </w:rPr>
+    </w:lvl>
+    <w:lvl w:ilvl="4" w:tplc="04090003" w:tentative="1">
+      <w:start w:val="1"/>
+      <w:numFmt w:val="bullet"/>
+      <w:lvlText w:val="o"/>
+      <w:lvlJc w:val="left"/>
+      <w:pPr>
+        <w:ind w:left="3600" w:hanging="360"/>
+      </w:pPr>
+      <w:rPr>
+        <w:rFonts w:ascii="Courier New" w:hAnsi="Courier New" w:cs="Courier New" w:hint="default"/>
+      </w:rPr>
+    </w:lvl>
+    <w:lvl w:ilvl="5" w:tplc="04090005" w:tentative="1">
+      <w:start w:val="1"/>
+      <w:numFmt w:val="bullet"/>
+      <w:lvlText w:val=""/>
+      <w:lvlJc w:val="left"/>
+      <w:pPr>
+        <w:ind w:left="4320" w:hanging="360"/>
+      </w:pPr>
+      <w:rPr>
+        <w:rFonts w:ascii="Wingdings" w:hAnsi="Wingdings" w:hint="default"/>
+      </w:rPr>
+    </w:lvl>
+    <w:lvl w:ilvl="6" w:tplc="04090001" w:tentative="1">
+      <w:start w:val="1"/>
+      <w:numFmt w:val="bullet"/>
+      <w:lvlText w:val=""/>
+      <w:lvlJc w:val="left"/>
+      <w:pPr>
+        <w:ind w:left="5040" w:hanging="360"/>
+      </w:pPr>
+      <w:rPr>
+        <w:rFonts w:ascii="Symbol" w:hAnsi="Symbol" w:hint="default"/>
+      </w:rPr>
+    </w:lvl>
+    <w:lvl w:ilvl="7" w:tplc="04090003" w:tentative="1">
+      <w:start w:val="1"/>
+      <w:numFmt w:val="bullet"/>
+      <w:lvlText w:val="o"/>
+      <w:lvlJc w:val="left"/>
+      <w:pPr>
+        <w:ind w:left="5760" w:hanging="360"/>
+      </w:pPr>
+      <w:rPr>
+        <w:rFonts w:ascii="Courier New" w:hAnsi="Courier New" w:cs="Courier New" w:hint="default"/>
+      </w:rPr>
+    </w:lvl>
+    <w:lvl w:ilvl="8" w:tplc="04090005" w:tentative="1">
+      <w:start w:val="1"/>
+      <w:numFmt w:val="bullet"/>
+      <w:lvlText w:val=""/>
+      <w:lvlJc w:val="left"/>
+      <w:pPr>
+        <w:ind w:left="6480" w:hanging="360"/>
+      </w:pPr>
+      <w:rPr>
+        <w:rFonts w:ascii="Wingdings" w:hAnsi="Wingdings" w:hint="default"/>
+      </w:rPr>
+    </w:lvl>
+  </w:abstractNum>
+  <w:abstractNum w:abstractNumId="3" w15:restartNumberingAfterBreak="0">
+    <w:nsid w:val="667E43E7"/>
+    <w:multiLevelType w:val="hybridMultilevel"/>
+    <w:tmpl w:val="4CE0AEEA"/>
+    <w:lvl w:ilvl="0" w:tplc="04090001">
+      <w:start w:val="1"/>
+      <w:numFmt w:val="bullet"/>
+      <w:lvlText w:val=""/>
+      <w:lvlJc w:val="left"/>
+      <w:pPr>
+        <w:ind w:left="720" w:hanging="360"/>
+      </w:pPr>
+      <w:rPr>
+        <w:rFonts w:ascii="Symbol" w:hAnsi="Symbol" w:hint="default"/>
+      </w:rPr>
+    </w:lvl>
+    <w:lvl w:ilvl="1" w:tplc="04090003" w:tentative="1">
+      <w:start w:val="1"/>
+      <w:numFmt w:val="bullet"/>
+      <w:lvlText w:val="o"/>
+      <w:lvlJc w:val="left"/>
+      <w:pPr>
+        <w:ind w:left="1440" w:hanging="360"/>
+      </w:pPr>
+      <w:rPr>
+        <w:rFonts w:ascii="Courier New" w:hAnsi="Courier New" w:cs="Courier New" w:hint="default"/>
+      </w:rPr>
+    </w:lvl>
+    <w:lvl w:ilvl="2" w:tplc="04090005" w:tentative="1">
+      <w:start w:val="1"/>
+      <w:numFmt w:val="bullet"/>
+      <w:lvlText w:val=""/>
+      <w:lvlJc w:val="left"/>
+      <w:pPr>
+        <w:ind w:left="2160" w:hanging="360"/>
+      </w:pPr>
+      <w:rPr>
+        <w:rFonts w:ascii="Wingdings" w:hAnsi="Wingdings" w:hint="default"/>
+      </w:rPr>
+    </w:lvl>
+    <w:lvl w:ilvl="3" w:tplc="04090001" w:tentative="1">
+      <w:start w:val="1"/>
+      <w:numFmt w:val="bullet"/>
+      <w:lvlText w:val=""/>
+      <w:lvlJc w:val="left"/>
+      <w:pPr>
+        <w:ind w:left="2880" w:hanging="360"/>
+      </w:pPr>
+      <w:rPr>
+        <w:rFonts w:ascii="Symbol" w:hAnsi="Symbol" w:hint="default"/>
+      </w:rPr>
+    </w:lvl>
+    <w:lvl w:ilvl="4" w:tplc="04090003" w:tentative="1">
+      <w:start w:val="1"/>
+      <w:numFmt w:val="bullet"/>
+      <w:lvlText w:val="o"/>
+      <w:lvlJc w:val="left"/>
+      <w:pPr>
+        <w:ind w:left="3600" w:hanging="360"/>
+      </w:pPr>
+      <w:rPr>
+        <w:rFonts w:ascii="Courier New" w:hAnsi="Courier New" w:cs="Courier New" w:hint="default"/>
+      </w:rPr>
+    </w:lvl>
+    <w:lvl w:ilvl="5" w:tplc="04090005" w:tentative="1">
+      <w:start w:val="1"/>
+      <w:numFmt w:val="bullet"/>
+      <w:lvlText w:val=""/>
+      <w:lvlJc w:val="left"/>
+      <w:pPr>
+        <w:ind w:left="4320" w:hanging="360"/>
+      </w:pPr>
+      <w:rPr>
+        <w:rFonts w:ascii="Wingdings" w:hAnsi="Wingdings" w:hint="default"/>
+      </w:rPr>
+    </w:lvl>
+    <w:lvl w:ilvl="6" w:tplc="04090001" w:tentative="1">
+      <w:start w:val="1"/>
+      <w:numFmt w:val="bullet"/>
+      <w:lvlText w:val=""/>
+      <w:lvlJc w:val="left"/>
+      <w:pPr>
+        <w:ind w:left="5040" w:hanging="360"/>
+      </w:pPr>
+      <w:rPr>
+        <w:rFonts w:ascii="Symbol" w:hAnsi="Symbol" w:hint="default"/>
+      </w:rPr>
+    </w:lvl>
+    <w:lvl w:ilvl="7" w:tplc="04090003" w:tentative="1">
+      <w:start w:val="1"/>
+      <w:numFmt w:val="bullet"/>
+      <w:lvlText w:val="o"/>
+      <w:lvlJc w:val="left"/>
+      <w:pPr>
+        <w:ind w:left="5760" w:hanging="360"/>
+      </w:pPr>
+      <w:rPr>
+        <w:rFonts w:ascii="Courier New" w:hAnsi="Courier New" w:cs="Courier New" w:hint="default"/>
+      </w:rPr>
+    </w:lvl>
+    <w:lvl w:ilvl="8" w:tplc="04090005" w:tentative="1">
+      <w:start w:val="1"/>
+      <w:numFmt w:val="bullet"/>
+      <w:lvlText w:val=""/>
+      <w:lvlJc w:val="left"/>
+      <w:pPr>
+        <w:ind w:left="6480" w:hanging="360"/>
+      </w:pPr>
+      <w:rPr>
+        <w:rFonts w:ascii="Wingdings" w:hAnsi="Wingdings" w:hint="default"/>
+      </w:rPr>
+    </w:lvl>
+  </w:abstractNum>
+  <w:num w:numId="1" w16cid:durableId="1985768041">
+    <w:abstractNumId w:val="1"/>
+  </w:num>
+  <w:num w:numId="2" w16cid:durableId="848102966">
+    <w:abstractNumId w:val="3"/>
+  </w:num>
+  <w:num w:numId="3" w16cid:durableId="1175221038">
+    <w:abstractNumId w:val="0"/>
+  </w:num>
+  <w:num w:numId="4" w16cid:durableId="2096322837">
+    <w:abstractNumId w:val="2"/>
+  </w:num>
+</w:numbering>
 </file>
 
 <file path=word/styles.xml><?xml version="1.0" encoding="utf-8"?>
@@ -1412,6 +2367,49 @@
       <w:shd w:val="clear" w:color="auto" w:fill="E1DFDD"/>
     </w:rPr>
   </w:style>
+  <w:style w:type="character" w:styleId="FollowedHyperlink">
+    <w:name w:val="FollowedHyperlink"/>
+    <w:basedOn w:val="DefaultParagraphFont"/>
+    <w:uiPriority w:val="99"/>
+    <w:semiHidden/>
+    <w:unhideWhenUsed/>
+    <w:rsid w:val="004036B7"/>
+    <w:rPr>
+      <w:color w:val="954F72" w:themeColor="followedHyperlink"/>
+      <w:u w:val="single"/>
+    </w:rPr>
+  </w:style>
+  <w:style w:type="paragraph" w:styleId="TOCHeading">
+    <w:name w:val="TOC Heading"/>
+    <w:basedOn w:val="Heading1"/>
+    <w:next w:val="Normal"/>
+    <w:uiPriority w:val="39"/>
+    <w:unhideWhenUsed/>
+    <w:qFormat/>
+    <w:rsid w:val="00594552"/>
+    <w:pPr>
+      <w:spacing w:before="240" w:after="0" w:line="259" w:lineRule="auto"/>
+      <w:outlineLvl w:val="9"/>
+    </w:pPr>
+    <w:rPr>
+      <w:kern w:val="0"/>
+      <w:sz w:val="32"/>
+      <w:szCs w:val="32"/>
+      <w14:ligatures w14:val="none"/>
+    </w:rPr>
+  </w:style>
+  <w:style w:type="paragraph" w:styleId="TOC1">
+    <w:name w:val="toc 1"/>
+    <w:basedOn w:val="Normal"/>
+    <w:next w:val="Normal"/>
+    <w:autoRedefine/>
+    <w:uiPriority w:val="39"/>
+    <w:unhideWhenUsed/>
+    <w:rsid w:val="00594552"/>
+    <w:pPr>
+      <w:spacing w:after="100"/>
+    </w:pPr>
+  </w:style>
 </w:styles>
 </file>
 
@@ -1708,4 +2706,16 @@
     </a:ext>
   </a:extLst>
 </a:theme>
+</file>
+
+<file path=customXml/item1.xml><?xml version="1.0" encoding="utf-8"?>
+<b:Sources xmlns:b="http://schemas.openxmlformats.org/officeDocument/2006/bibliography" xmlns="http://schemas.openxmlformats.org/officeDocument/2006/bibliography" SelectedStyle="\APASixthEditionOfficeOnline.xsl" StyleName="APA" Version="6"/>
+</file>
+
+<file path=customXml/itemProps1.xml><?xml version="1.0" encoding="utf-8"?>
+<ds:datastoreItem xmlns:ds="http://schemas.openxmlformats.org/officeDocument/2006/customXml" ds:itemID="{B5D0CB48-AA45-4429-B121-97F701D7BBF1}">
+  <ds:schemaRefs>
+    <ds:schemaRef ds:uri="http://schemas.openxmlformats.org/officeDocument/2006/bibliography"/>
+  </ds:schemaRefs>
+</ds:datastoreItem>
 </file>
</xml_diff>

<commit_message>
get pe toti angajatii. Adaugare api-key. Adaugare dependente necesare pentru documentare  endpointurilor urileor
</commit_message>
<xml_diff>
--- a/Documentatie.docx
+++ b/Documentatie.docx
@@ -19,6 +19,14 @@
     <w:p/>
     <w:sdt>
       <w:sdtPr>
+        <w:rPr>
+          <w:rFonts w:asciiTheme="minorHAnsi" w:eastAsiaTheme="minorHAnsi" w:hAnsiTheme="minorHAnsi" w:cstheme="minorBidi"/>
+          <w:color w:val="auto"/>
+          <w:kern w:val="2"/>
+          <w:sz w:val="24"/>
+          <w:szCs w:val="24"/>
+          <w14:ligatures w14:val="standardContextual"/>
+        </w:rPr>
         <w:id w:val="1957518568"/>
         <w:docPartObj>
           <w:docPartGallery w:val="Table of Contents"/>
@@ -27,15 +35,9 @@
       </w:sdtPr>
       <w:sdtEndPr>
         <w:rPr>
-          <w:rFonts w:asciiTheme="minorHAnsi" w:eastAsiaTheme="minorHAnsi" w:hAnsiTheme="minorHAnsi" w:cstheme="minorBidi"/>
           <w:b/>
           <w:bCs/>
           <w:noProof/>
-          <w:color w:val="auto"/>
-          <w:kern w:val="2"/>
-          <w:sz w:val="24"/>
-          <w:szCs w:val="24"/>
-          <w14:ligatures w14:val="standardContextual"/>
         </w:rPr>
       </w:sdtEndPr>
       <w:sdtContent>
@@ -891,19 +893,7 @@
           <w:rPr>
             <w:rStyle w:val="Hyperlink"/>
           </w:rPr>
-          <w:t>https://www.baeldu</w:t>
-        </w:r>
-        <w:r>
-          <w:rPr>
-            <w:rStyle w:val="Hyperlink"/>
-          </w:rPr>
-          <w:t>n</w:t>
-        </w:r>
-        <w:r>
-          <w:rPr>
-            <w:rStyle w:val="Hyperlink"/>
-          </w:rPr>
-          <w:t>g.com/java-validation</w:t>
+          <w:t>https://www.baeldung.com/java-validation</w:t>
         </w:r>
       </w:hyperlink>
     </w:p>
@@ -938,6 +928,74 @@
             <w:rStyle w:val="Hyperlink"/>
           </w:rPr>
           <w:t>https://www.baeldung.com/spring-boot-return-errors-problemdetail</w:t>
+        </w:r>
+      </w:hyperlink>
+    </w:p>
+    <w:p>
+      <w:pPr>
+        <w:pStyle w:val="ListParagraph"/>
+        <w:numPr>
+          <w:ilvl w:val="0"/>
+          <w:numId w:val="2"/>
+        </w:numPr>
+      </w:pPr>
+      <w:hyperlink r:id="rId11" w:history="1">
+        <w:r>
+          <w:rPr>
+            <w:rStyle w:val="Hyperlink"/>
+          </w:rPr>
+          <w:t>https://microsoft.github.io/code-with-engineering-playbook/design/design-patterns/rest-api-design-guidance/</w:t>
+        </w:r>
+      </w:hyperlink>
+    </w:p>
+    <w:p>
+      <w:pPr>
+        <w:pStyle w:val="ListParagraph"/>
+        <w:numPr>
+          <w:ilvl w:val="0"/>
+          <w:numId w:val="2"/>
+        </w:numPr>
+      </w:pPr>
+      <w:hyperlink r:id="rId12" w:history="1">
+        <w:r>
+          <w:rPr>
+            <w:rStyle w:val="Hyperlink"/>
+          </w:rPr>
+          <w:t>https://www.baeldung.com/spring-data-sorting</w:t>
+        </w:r>
+      </w:hyperlink>
+    </w:p>
+    <w:p>
+      <w:pPr>
+        <w:pStyle w:val="ListParagraph"/>
+        <w:numPr>
+          <w:ilvl w:val="0"/>
+          <w:numId w:val="2"/>
+        </w:numPr>
+      </w:pPr>
+      <w:hyperlink r:id="rId13" w:history="1">
+        <w:r>
+          <w:rPr>
+            <w:rStyle w:val="Hyperlink"/>
+          </w:rPr>
+          <w:t>https://www.geeksforgeeks.org/springboot/working-with-http-headers-in-spring-mvc-requestheader-and-responseheader/</w:t>
+        </w:r>
+      </w:hyperlink>
+    </w:p>
+    <w:p>
+      <w:pPr>
+        <w:pStyle w:val="ListParagraph"/>
+        <w:numPr>
+          <w:ilvl w:val="0"/>
+          <w:numId w:val="2"/>
+        </w:numPr>
+      </w:pPr>
+      <w:hyperlink r:id="rId14" w:history="1">
+        <w:r>
+          <w:rPr>
+            <w:rStyle w:val="Hyperlink"/>
+          </w:rPr>
+          <w:t>https://www.baeldung.com/spring-rest-openapi-documentation</w:t>
         </w:r>
       </w:hyperlink>
     </w:p>

</xml_diff>

<commit_message>
adaugare justificare alegere SEQUENCE  in Documentatie.docx
</commit_message>
<xml_diff>
--- a/Documentatie.docx
+++ b/Documentatie.docx
@@ -75,7 +75,7 @@
               <w:tab w:val="right" w:leader="dot" w:pos="9350"/>
             </w:tabs>
             <w:rPr>
-              <w:rFonts w:eastAsiaTheme="minorEastAsia" w:cstheme="minorHAnsi"/>
+              <w:rFonts w:eastAsiaTheme="minorEastAsia"/>
               <w:noProof/>
             </w:rPr>
           </w:pPr>
@@ -97,18 +97,17 @@
             </w:rPr>
             <w:fldChar w:fldCharType="separate"/>
           </w:r>
-          <w:hyperlink w:anchor="_Toc234813815" w:history="1">
+          <w:hyperlink w:anchor="_Toc235545198" w:history="1">
             <w:r>
               <w:rPr>
                 <w:rStyle w:val="Hyperlink"/>
                 <w:rFonts w:cstheme="minorHAnsi"/>
                 <w:noProof/>
               </w:rPr>
-              <w:t>TODO</w:t>
+              <w:t>Descriere</w:t>
             </w:r>
             <w:r>
               <w:rPr>
-                <w:rFonts w:cstheme="minorHAnsi"/>
                 <w:noProof/>
                 <w:webHidden/>
               </w:rPr>
@@ -116,7 +115,6 @@
             </w:r>
             <w:r>
               <w:rPr>
-                <w:rFonts w:cstheme="minorHAnsi"/>
                 <w:noProof/>
                 <w:webHidden/>
               </w:rPr>
@@ -124,22 +122,19 @@
             </w:r>
             <w:r>
               <w:rPr>
-                <w:rFonts w:cstheme="minorHAnsi"/>
                 <w:noProof/>
                 <w:webHidden/>
               </w:rPr>
-              <w:instrText xml:space="preserve"> PAGEREF _Toc234813815 \h </w:instrText>
+              <w:instrText xml:space="preserve"> PAGEREF _Toc235545198 \h </w:instrText>
             </w:r>
             <w:r>
               <w:rPr>
-                <w:rFonts w:cstheme="minorHAnsi"/>
                 <w:noProof/>
                 <w:webHidden/>
               </w:rPr>
             </w:r>
             <w:r>
               <w:rPr>
-                <w:rFonts w:cstheme="minorHAnsi"/>
                 <w:noProof/>
                 <w:webHidden/>
               </w:rPr>
@@ -147,7 +142,6 @@
             </w:r>
             <w:r>
               <w:rPr>
-                <w:rFonts w:cstheme="minorHAnsi"/>
                 <w:noProof/>
                 <w:webHidden/>
               </w:rPr>
@@ -155,7 +149,6 @@
             </w:r>
             <w:r>
               <w:rPr>
-                <w:rFonts w:cstheme="minorHAnsi"/>
                 <w:noProof/>
                 <w:webHidden/>
               </w:rPr>
@@ -170,22 +163,21 @@
               <w:tab w:val="right" w:leader="dot" w:pos="9350"/>
             </w:tabs>
             <w:rPr>
-              <w:rFonts w:eastAsiaTheme="minorEastAsia" w:cstheme="minorHAnsi"/>
+              <w:rFonts w:eastAsiaTheme="minorEastAsia"/>
               <w:noProof/>
             </w:rPr>
           </w:pPr>
-          <w:hyperlink w:anchor="_Toc234813816" w:history="1">
+          <w:hyperlink w:anchor="_Toc235545199" w:history="1">
             <w:r>
               <w:rPr>
                 <w:rStyle w:val="Hyperlink"/>
                 <w:rFonts w:cstheme="minorHAnsi"/>
                 <w:noProof/>
               </w:rPr>
-              <w:t>Endpoint-uri</w:t>
+              <w:t>TODO</w:t>
             </w:r>
             <w:r>
               <w:rPr>
-                <w:rFonts w:cstheme="minorHAnsi"/>
                 <w:noProof/>
                 <w:webHidden/>
               </w:rPr>
@@ -193,7 +185,6 @@
             </w:r>
             <w:r>
               <w:rPr>
-                <w:rFonts w:cstheme="minorHAnsi"/>
                 <w:noProof/>
                 <w:webHidden/>
               </w:rPr>
@@ -201,22 +192,19 @@
             </w:r>
             <w:r>
               <w:rPr>
-                <w:rFonts w:cstheme="minorHAnsi"/>
                 <w:noProof/>
                 <w:webHidden/>
               </w:rPr>
-              <w:instrText xml:space="preserve"> PAGEREF _Toc234813816 \h </w:instrText>
+              <w:instrText xml:space="preserve"> PAGEREF _Toc235545199 \h </w:instrText>
             </w:r>
             <w:r>
               <w:rPr>
-                <w:rFonts w:cstheme="minorHAnsi"/>
                 <w:noProof/>
                 <w:webHidden/>
               </w:rPr>
             </w:r>
             <w:r>
               <w:rPr>
-                <w:rFonts w:cstheme="minorHAnsi"/>
                 <w:noProof/>
                 <w:webHidden/>
               </w:rPr>
@@ -224,7 +212,6 @@
             </w:r>
             <w:r>
               <w:rPr>
-                <w:rFonts w:cstheme="minorHAnsi"/>
                 <w:noProof/>
                 <w:webHidden/>
               </w:rPr>
@@ -232,7 +219,6 @@
             </w:r>
             <w:r>
               <w:rPr>
-                <w:rFonts w:cstheme="minorHAnsi"/>
                 <w:noProof/>
                 <w:webHidden/>
               </w:rPr>
@@ -247,11 +233,81 @@
               <w:tab w:val="right" w:leader="dot" w:pos="9350"/>
             </w:tabs>
             <w:rPr>
-              <w:rFonts w:eastAsiaTheme="minorEastAsia" w:cstheme="minorHAnsi"/>
+              <w:rFonts w:eastAsiaTheme="minorEastAsia"/>
               <w:noProof/>
             </w:rPr>
           </w:pPr>
-          <w:hyperlink w:anchor="_Toc234813817" w:history="1">
+          <w:hyperlink w:anchor="_Toc235545200" w:history="1">
+            <w:r>
+              <w:rPr>
+                <w:rStyle w:val="Hyperlink"/>
+                <w:rFonts w:cstheme="minorHAnsi"/>
+                <w:noProof/>
+              </w:rPr>
+              <w:t>Endpoint-uri</w:t>
+            </w:r>
+            <w:r>
+              <w:rPr>
+                <w:noProof/>
+                <w:webHidden/>
+              </w:rPr>
+              <w:tab/>
+            </w:r>
+            <w:r>
+              <w:rPr>
+                <w:noProof/>
+                <w:webHidden/>
+              </w:rPr>
+              <w:fldChar w:fldCharType="begin"/>
+            </w:r>
+            <w:r>
+              <w:rPr>
+                <w:noProof/>
+                <w:webHidden/>
+              </w:rPr>
+              <w:instrText xml:space="preserve"> PAGEREF _Toc235545200 \h </w:instrText>
+            </w:r>
+            <w:r>
+              <w:rPr>
+                <w:noProof/>
+                <w:webHidden/>
+              </w:rPr>
+            </w:r>
+            <w:r>
+              <w:rPr>
+                <w:noProof/>
+                <w:webHidden/>
+              </w:rPr>
+              <w:fldChar w:fldCharType="separate"/>
+            </w:r>
+            <w:r>
+              <w:rPr>
+                <w:noProof/>
+                <w:webHidden/>
+              </w:rPr>
+              <w:t>2</w:t>
+            </w:r>
+            <w:r>
+              <w:rPr>
+                <w:noProof/>
+                <w:webHidden/>
+              </w:rPr>
+              <w:fldChar w:fldCharType="end"/>
+            </w:r>
+          </w:hyperlink>
+        </w:p>
+        <w:p>
+          <w:pPr>
+            <w:pStyle w:val="TOC1"/>
+            <w:tabs>
+              <w:tab w:val="right" w:leader="dot" w:pos="9350"/>
+            </w:tabs>
+            <w:rPr>
+              <w:rFonts w:eastAsiaTheme="minorEastAsia"/>
+              <w:noProof/>
+            </w:rPr>
+          </w:pPr>
+          <w:hyperlink w:anchor="_Toc235545201" w:history="1">
             <w:r>
               <w:rPr>
                 <w:rStyle w:val="Hyperlink"/>
@@ -262,7 +318,6 @@
             </w:r>
             <w:r>
               <w:rPr>
-                <w:rFonts w:cstheme="minorHAnsi"/>
                 <w:noProof/>
                 <w:webHidden/>
               </w:rPr>
@@ -270,7 +325,6 @@
             </w:r>
             <w:r>
               <w:rPr>
-                <w:rFonts w:cstheme="minorHAnsi"/>
                 <w:noProof/>
                 <w:webHidden/>
               </w:rPr>
@@ -278,22 +332,19 @@
             </w:r>
             <w:r>
               <w:rPr>
-                <w:rFonts w:cstheme="minorHAnsi"/>
                 <w:noProof/>
                 <w:webHidden/>
               </w:rPr>
-              <w:instrText xml:space="preserve"> PAGEREF _Toc234813817 \h </w:instrText>
+              <w:instrText xml:space="preserve"> PAGEREF _Toc235545201 \h </w:instrText>
             </w:r>
             <w:r>
               <w:rPr>
-                <w:rFonts w:cstheme="minorHAnsi"/>
                 <w:noProof/>
                 <w:webHidden/>
               </w:rPr>
             </w:r>
             <w:r>
               <w:rPr>
-                <w:rFonts w:cstheme="minorHAnsi"/>
                 <w:noProof/>
                 <w:webHidden/>
               </w:rPr>
@@ -301,7 +352,6 @@
             </w:r>
             <w:r>
               <w:rPr>
-                <w:rFonts w:cstheme="minorHAnsi"/>
                 <w:noProof/>
                 <w:webHidden/>
               </w:rPr>
@@ -309,7 +359,6 @@
             </w:r>
             <w:r>
               <w:rPr>
-                <w:rFonts w:cstheme="minorHAnsi"/>
                 <w:noProof/>
                 <w:webHidden/>
               </w:rPr>
@@ -324,11 +373,11 @@
               <w:tab w:val="right" w:leader="dot" w:pos="9350"/>
             </w:tabs>
             <w:rPr>
-              <w:rFonts w:cstheme="minorHAnsi"/>
+              <w:rFonts w:eastAsiaTheme="minorEastAsia"/>
               <w:noProof/>
             </w:rPr>
           </w:pPr>
-          <w:hyperlink w:anchor="_Toc234813818" w:history="1">
+          <w:hyperlink w:anchor="_Toc235545202" w:history="1">
             <w:r>
               <w:rPr>
                 <w:rStyle w:val="Hyperlink"/>
@@ -339,7 +388,6 @@
             </w:r>
             <w:r>
               <w:rPr>
-                <w:rFonts w:cstheme="minorHAnsi"/>
                 <w:noProof/>
                 <w:webHidden/>
               </w:rPr>
@@ -347,7 +395,6 @@
             </w:r>
             <w:r>
               <w:rPr>
-                <w:rFonts w:cstheme="minorHAnsi"/>
                 <w:noProof/>
                 <w:webHidden/>
               </w:rPr>
@@ -355,22 +402,19 @@
             </w:r>
             <w:r>
               <w:rPr>
-                <w:rFonts w:cstheme="minorHAnsi"/>
                 <w:noProof/>
                 <w:webHidden/>
               </w:rPr>
-              <w:instrText xml:space="preserve"> PAGEREF _Toc234813818 \h </w:instrText>
+              <w:instrText xml:space="preserve"> PAGEREF _Toc235545202 \h </w:instrText>
             </w:r>
             <w:r>
               <w:rPr>
-                <w:rFonts w:cstheme="minorHAnsi"/>
                 <w:noProof/>
                 <w:webHidden/>
               </w:rPr>
             </w:r>
             <w:r>
               <w:rPr>
-                <w:rFonts w:cstheme="minorHAnsi"/>
                 <w:noProof/>
                 <w:webHidden/>
               </w:rPr>
@@ -378,7 +422,6 @@
             </w:r>
             <w:r>
               <w:rPr>
-                <w:rFonts w:cstheme="minorHAnsi"/>
                 <w:noProof/>
                 <w:webHidden/>
               </w:rPr>
@@ -386,7 +429,6 @@
             </w:r>
             <w:r>
               <w:rPr>
-                <w:rFonts w:cstheme="minorHAnsi"/>
                 <w:noProof/>
                 <w:webHidden/>
               </w:rPr>
@@ -401,11 +443,11 @@
               <w:tab w:val="right" w:leader="dot" w:pos="9350"/>
             </w:tabs>
             <w:rPr>
-              <w:rFonts w:eastAsiaTheme="minorEastAsia" w:cstheme="minorHAnsi"/>
+              <w:rFonts w:eastAsiaTheme="minorEastAsia"/>
               <w:noProof/>
             </w:rPr>
           </w:pPr>
-          <w:hyperlink w:anchor="_Toc234813819" w:history="1">
+          <w:hyperlink w:anchor="_Toc235545203" w:history="1">
             <w:r>
               <w:rPr>
                 <w:rStyle w:val="Hyperlink"/>
@@ -416,7 +458,6 @@
             </w:r>
             <w:r>
               <w:rPr>
-                <w:rFonts w:cstheme="minorHAnsi"/>
                 <w:noProof/>
                 <w:webHidden/>
               </w:rPr>
@@ -424,7 +465,6 @@
             </w:r>
             <w:r>
               <w:rPr>
-                <w:rFonts w:cstheme="minorHAnsi"/>
                 <w:noProof/>
                 <w:webHidden/>
               </w:rPr>
@@ -432,22 +472,19 @@
             </w:r>
             <w:r>
               <w:rPr>
-                <w:rFonts w:cstheme="minorHAnsi"/>
                 <w:noProof/>
                 <w:webHidden/>
               </w:rPr>
-              <w:instrText xml:space="preserve"> PAGEREF _Toc234813819 \h </w:instrText>
+              <w:instrText xml:space="preserve"> PAGEREF _Toc235545203 \h </w:instrText>
             </w:r>
             <w:r>
               <w:rPr>
-                <w:rFonts w:cstheme="minorHAnsi"/>
                 <w:noProof/>
                 <w:webHidden/>
               </w:rPr>
             </w:r>
             <w:r>
               <w:rPr>
-                <w:rFonts w:cstheme="minorHAnsi"/>
                 <w:noProof/>
                 <w:webHidden/>
               </w:rPr>
@@ -455,15 +492,13 @@
             </w:r>
             <w:r>
               <w:rPr>
-                <w:rFonts w:cstheme="minorHAnsi"/>
                 <w:noProof/>
                 <w:webHidden/>
               </w:rPr>
-              <w:t>12</w:t>
+              <w:t>13</w:t>
             </w:r>
             <w:r>
               <w:rPr>
-                <w:rFonts w:cstheme="minorHAnsi"/>
                 <w:noProof/>
                 <w:webHidden/>
               </w:rPr>
@@ -478,11 +513,11 @@
               <w:tab w:val="right" w:leader="dot" w:pos="9350"/>
             </w:tabs>
             <w:rPr>
-              <w:rFonts w:eastAsiaTheme="minorEastAsia" w:cstheme="minorHAnsi"/>
+              <w:rFonts w:eastAsiaTheme="minorEastAsia"/>
               <w:noProof/>
             </w:rPr>
           </w:pPr>
-          <w:hyperlink w:anchor="_Toc234813820" w:history="1">
+          <w:hyperlink w:anchor="_Toc235545204" w:history="1">
             <w:r>
               <w:rPr>
                 <w:rStyle w:val="Hyperlink"/>
@@ -493,7 +528,6 @@
             </w:r>
             <w:r>
               <w:rPr>
-                <w:rFonts w:cstheme="minorHAnsi"/>
                 <w:noProof/>
                 <w:webHidden/>
               </w:rPr>
@@ -501,7 +535,6 @@
             </w:r>
             <w:r>
               <w:rPr>
-                <w:rFonts w:cstheme="minorHAnsi"/>
                 <w:noProof/>
                 <w:webHidden/>
               </w:rPr>
@@ -509,22 +542,19 @@
             </w:r>
             <w:r>
               <w:rPr>
-                <w:rFonts w:cstheme="minorHAnsi"/>
                 <w:noProof/>
                 <w:webHidden/>
               </w:rPr>
-              <w:instrText xml:space="preserve"> PAGEREF _Toc234813820 \h </w:instrText>
+              <w:instrText xml:space="preserve"> PAGEREF _Toc235545204 \h </w:instrText>
             </w:r>
             <w:r>
               <w:rPr>
-                <w:rFonts w:cstheme="minorHAnsi"/>
                 <w:noProof/>
                 <w:webHidden/>
               </w:rPr>
             </w:r>
             <w:r>
               <w:rPr>
-                <w:rFonts w:cstheme="minorHAnsi"/>
                 <w:noProof/>
                 <w:webHidden/>
               </w:rPr>
@@ -532,15 +562,234 @@
             </w:r>
             <w:r>
               <w:rPr>
-                <w:rFonts w:cstheme="minorHAnsi"/>
                 <w:noProof/>
                 <w:webHidden/>
               </w:rPr>
-              <w:t>12</w:t>
+              <w:t>13</w:t>
             </w:r>
             <w:r>
               <w:rPr>
-                <w:rFonts w:cstheme="minorHAnsi"/>
+                <w:noProof/>
+                <w:webHidden/>
+              </w:rPr>
+              <w:fldChar w:fldCharType="end"/>
+            </w:r>
+          </w:hyperlink>
+        </w:p>
+        <w:p>
+          <w:pPr>
+            <w:pStyle w:val="TOC1"/>
+            <w:tabs>
+              <w:tab w:val="right" w:leader="dot" w:pos="9350"/>
+            </w:tabs>
+            <w:rPr>
+              <w:rFonts w:eastAsiaTheme="minorEastAsia"/>
+              <w:noProof/>
+            </w:rPr>
+          </w:pPr>
+          <w:hyperlink w:anchor="_Toc235545205" w:history="1">
+            <w:r>
+              <w:rPr>
+                <w:rStyle w:val="Hyperlink"/>
+                <w:noProof/>
+              </w:rPr>
+              <w:t>Review</w:t>
+            </w:r>
+            <w:r>
+              <w:rPr>
+                <w:noProof/>
+                <w:webHidden/>
+              </w:rPr>
+              <w:tab/>
+            </w:r>
+            <w:r>
+              <w:rPr>
+                <w:noProof/>
+                <w:webHidden/>
+              </w:rPr>
+              <w:fldChar w:fldCharType="begin"/>
+            </w:r>
+            <w:r>
+              <w:rPr>
+                <w:noProof/>
+                <w:webHidden/>
+              </w:rPr>
+              <w:instrText xml:space="preserve"> PAGEREF _Toc235545205 \h </w:instrText>
+            </w:r>
+            <w:r>
+              <w:rPr>
+                <w:noProof/>
+                <w:webHidden/>
+              </w:rPr>
+            </w:r>
+            <w:r>
+              <w:rPr>
+                <w:noProof/>
+                <w:webHidden/>
+              </w:rPr>
+              <w:fldChar w:fldCharType="separate"/>
+            </w:r>
+            <w:r>
+              <w:rPr>
+                <w:noProof/>
+                <w:webHidden/>
+              </w:rPr>
+              <w:t>14</w:t>
+            </w:r>
+            <w:r>
+              <w:rPr>
+                <w:noProof/>
+                <w:webHidden/>
+              </w:rPr>
+              <w:fldChar w:fldCharType="end"/>
+            </w:r>
+          </w:hyperlink>
+        </w:p>
+        <w:p>
+          <w:pPr>
+            <w:pStyle w:val="TOC2"/>
+            <w:tabs>
+              <w:tab w:val="right" w:leader="dot" w:pos="9350"/>
+            </w:tabs>
+            <w:rPr>
+              <w:rFonts w:eastAsiaTheme="minorEastAsia"/>
+              <w:noProof/>
+            </w:rPr>
+          </w:pPr>
+          <w:hyperlink w:anchor="_Toc235545206" w:history="1">
+            <w:r>
+              <w:rPr>
+                <w:rStyle w:val="Hyperlink"/>
+                <w:noProof/>
+              </w:rPr>
+              <w:t>#1 20.07.2026</w:t>
+            </w:r>
+            <w:r>
+              <w:rPr>
+                <w:noProof/>
+                <w:webHidden/>
+              </w:rPr>
+              <w:tab/>
+            </w:r>
+            <w:r>
+              <w:rPr>
+                <w:noProof/>
+                <w:webHidden/>
+              </w:rPr>
+              <w:fldChar w:fldCharType="begin"/>
+            </w:r>
+            <w:r>
+              <w:rPr>
+                <w:noProof/>
+                <w:webHidden/>
+              </w:rPr>
+              <w:instrText xml:space="preserve"> PAGEREF _Toc235545206 \h </w:instrText>
+            </w:r>
+            <w:r>
+              <w:rPr>
+                <w:noProof/>
+                <w:webHidden/>
+              </w:rPr>
+            </w:r>
+            <w:r>
+              <w:rPr>
+                <w:noProof/>
+                <w:webHidden/>
+              </w:rPr>
+              <w:fldChar w:fldCharType="separate"/>
+            </w:r>
+            <w:r>
+              <w:rPr>
+                <w:noProof/>
+                <w:webHidden/>
+              </w:rPr>
+              <w:t>14</w:t>
+            </w:r>
+            <w:r>
+              <w:rPr>
+                <w:noProof/>
+                <w:webHidden/>
+              </w:rPr>
+              <w:fldChar w:fldCharType="end"/>
+            </w:r>
+          </w:hyperlink>
+        </w:p>
+        <w:p>
+          <w:pPr>
+            <w:pStyle w:val="TOC1"/>
+            <w:tabs>
+              <w:tab w:val="right" w:leader="dot" w:pos="9350"/>
+            </w:tabs>
+            <w:rPr>
+              <w:rFonts w:eastAsiaTheme="minorEastAsia"/>
+              <w:noProof/>
+            </w:rPr>
+          </w:pPr>
+          <w:hyperlink w:anchor="_Toc235545207" w:history="1">
+            <w:r>
+              <w:rPr>
+                <w:rStyle w:val="Hyperlink"/>
+                <w:noProof/>
+              </w:rPr>
+              <w:t>Justificare Seq</w:t>
+            </w:r>
+            <w:r>
+              <w:rPr>
+                <w:rStyle w:val="Hyperlink"/>
+                <w:noProof/>
+              </w:rPr>
+              <w:t>u</w:t>
+            </w:r>
+            <w:r>
+              <w:rPr>
+                <w:rStyle w:val="Hyperlink"/>
+                <w:noProof/>
+              </w:rPr>
+              <w:t>ence</w:t>
+            </w:r>
+            <w:r>
+              <w:rPr>
+                <w:noProof/>
+                <w:webHidden/>
+              </w:rPr>
+              <w:tab/>
+            </w:r>
+            <w:r>
+              <w:rPr>
+                <w:noProof/>
+                <w:webHidden/>
+              </w:rPr>
+              <w:fldChar w:fldCharType="begin"/>
+            </w:r>
+            <w:r>
+              <w:rPr>
+                <w:noProof/>
+                <w:webHidden/>
+              </w:rPr>
+              <w:instrText xml:space="preserve"> PAGEREF _Toc235545207 \h </w:instrText>
+            </w:r>
+            <w:r>
+              <w:rPr>
+                <w:noProof/>
+                <w:webHidden/>
+              </w:rPr>
+            </w:r>
+            <w:r>
+              <w:rPr>
+                <w:noProof/>
+                <w:webHidden/>
+              </w:rPr>
+              <w:fldChar w:fldCharType="separate"/>
+            </w:r>
+            <w:r>
+              <w:rPr>
+                <w:noProof/>
+                <w:webHidden/>
+              </w:rPr>
+              <w:t>15</w:t>
+            </w:r>
+            <w:r>
+              <w:rPr>
                 <w:noProof/>
                 <w:webHidden/>
               </w:rPr>
@@ -571,7 +820,7 @@
           <w:rFonts w:asciiTheme="minorHAnsi" w:hAnsiTheme="minorHAnsi" w:cstheme="minorHAnsi"/>
         </w:rPr>
       </w:pPr>
-      <w:bookmarkStart w:id="0" w:name="_Toc234813815"/>
+      <w:bookmarkStart w:id="0" w:name="_Toc235545198"/>
       <w:proofErr w:type="spellStart"/>
       <w:r>
         <w:rPr>
@@ -579,6 +828,7 @@
         </w:rPr>
         <w:t>Descriere</w:t>
       </w:r>
+      <w:bookmarkEnd w:id="0"/>
       <w:proofErr w:type="spellEnd"/>
       <w:r>
         <w:rPr>
@@ -1595,13 +1845,14 @@
           <w:rFonts w:asciiTheme="minorHAnsi" w:hAnsiTheme="minorHAnsi" w:cstheme="minorHAnsi"/>
         </w:rPr>
       </w:pPr>
+      <w:bookmarkStart w:id="1" w:name="_Toc235545199"/>
       <w:r>
         <w:rPr>
           <w:rFonts w:asciiTheme="minorHAnsi" w:hAnsiTheme="minorHAnsi" w:cstheme="minorHAnsi"/>
         </w:rPr>
         <w:t>TODO</w:t>
       </w:r>
-      <w:bookmarkEnd w:id="0"/>
+      <w:bookmarkEnd w:id="1"/>
     </w:p>
     <w:p>
       <w:pPr>
@@ -1792,6 +2043,7 @@
         <w:rPr>
           <w:rFonts w:cstheme="minorHAnsi"/>
         </w:rPr>
+        <w:lastRenderedPageBreak/>
         <w:t>Utilizare</w:t>
       </w:r>
       <w:proofErr w:type="spellEnd"/>
@@ -1979,7 +2231,6 @@
         <w:rPr>
           <w:rFonts w:cstheme="minorHAnsi"/>
         </w:rPr>
-        <w:lastRenderedPageBreak/>
         <w:t>201 Created: New resource created successfully</w:t>
       </w:r>
     </w:p>
@@ -2008,7 +2259,7 @@
           <w:rFonts w:asciiTheme="minorHAnsi" w:hAnsiTheme="minorHAnsi" w:cstheme="minorHAnsi"/>
         </w:rPr>
       </w:pPr>
-      <w:bookmarkStart w:id="1" w:name="_Toc234813816"/>
+      <w:bookmarkStart w:id="2" w:name="_Toc235545200"/>
       <w:r>
         <w:rPr>
           <w:rFonts w:asciiTheme="minorHAnsi" w:hAnsiTheme="minorHAnsi" w:cstheme="minorHAnsi"/>
@@ -2022,7 +2273,7 @@
         </w:rPr>
         <w:t>uri</w:t>
       </w:r>
-      <w:bookmarkEnd w:id="1"/>
+      <w:bookmarkEnd w:id="2"/>
       <w:proofErr w:type="spellEnd"/>
     </w:p>
     <w:p>
@@ -2634,7 +2885,7 @@
           <w:rFonts w:asciiTheme="minorHAnsi" w:hAnsiTheme="minorHAnsi" w:cstheme="minorHAnsi"/>
         </w:rPr>
       </w:pPr>
-      <w:bookmarkStart w:id="2" w:name="_Toc234813817"/>
+      <w:bookmarkStart w:id="3" w:name="_Toc235545201"/>
       <w:proofErr w:type="spellStart"/>
       <w:r>
         <w:rPr>
@@ -2656,7 +2907,7 @@
         </w:rPr>
         <w:t>uri</w:t>
       </w:r>
-      <w:bookmarkEnd w:id="2"/>
+      <w:bookmarkEnd w:id="3"/>
       <w:proofErr w:type="spellEnd"/>
     </w:p>
     <w:p>
@@ -2666,7 +2917,7 @@
           <w:rFonts w:asciiTheme="minorHAnsi" w:hAnsiTheme="minorHAnsi" w:cstheme="minorHAnsi"/>
         </w:rPr>
       </w:pPr>
-      <w:bookmarkStart w:id="3" w:name="_Toc234813818"/>
+      <w:bookmarkStart w:id="4" w:name="_Toc235545202"/>
       <w:proofErr w:type="spellStart"/>
       <w:r>
         <w:rPr>
@@ -2688,7 +2939,7 @@
         </w:rPr>
         <w:t>uri</w:t>
       </w:r>
-      <w:bookmarkEnd w:id="3"/>
+      <w:bookmarkEnd w:id="4"/>
       <w:proofErr w:type="spellEnd"/>
     </w:p>
     <w:p>
@@ -2968,7 +3219,9 @@
       <w:r>
         <w:rPr>
           <w:rFonts w:cstheme="minorHAnsi"/>
-        </w:rPr>
+          <w:noProof/>
+        </w:rPr>
+        <w:lastRenderedPageBreak/>
         <w:drawing>
           <wp:inline distT="0" distB="0" distL="0" distR="0" wp14:anchorId="28BCA762" wp14:editId="04001AD4">
             <wp:extent cx="5943600" cy="2410460"/>
@@ -3021,7 +3274,6 @@
         <w:rPr>
           <w:rFonts w:cstheme="minorHAnsi"/>
         </w:rPr>
-        <w:lastRenderedPageBreak/>
         <w:t>Creare</w:t>
       </w:r>
       <w:proofErr w:type="spellEnd"/>
@@ -3078,6 +3330,7 @@
       <w:r>
         <w:rPr>
           <w:rFonts w:cstheme="minorHAnsi"/>
+          <w:noProof/>
         </w:rPr>
         <w:drawing>
           <wp:inline distT="0" distB="0" distL="0" distR="0" wp14:anchorId="23D9035B" wp14:editId="6CC77E60">
@@ -3187,7 +3440,9 @@
       <w:r>
         <w:rPr>
           <w:rFonts w:cstheme="minorHAnsi"/>
-        </w:rPr>
+          <w:noProof/>
+        </w:rPr>
+        <w:lastRenderedPageBreak/>
         <w:drawing>
           <wp:inline distT="0" distB="0" distL="0" distR="0" wp14:anchorId="5DAA8812" wp14:editId="5FD073E2">
             <wp:extent cx="5943600" cy="3022600"/>
@@ -3288,8 +3543,8 @@
       <w:r>
         <w:rPr>
           <w:rFonts w:cstheme="minorHAnsi"/>
-        </w:rPr>
-        <w:lastRenderedPageBreak/>
+          <w:noProof/>
+        </w:rPr>
         <w:drawing>
           <wp:inline distT="0" distB="0" distL="0" distR="0" wp14:anchorId="79F5164F" wp14:editId="44B5386D">
             <wp:extent cx="5943600" cy="2884170"/>
@@ -3398,7 +3653,9 @@
       <w:r>
         <w:rPr>
           <w:rFonts w:cstheme="minorHAnsi"/>
-        </w:rPr>
+          <w:noProof/>
+        </w:rPr>
+        <w:lastRenderedPageBreak/>
         <w:drawing>
           <wp:inline distT="0" distB="0" distL="0" distR="0" wp14:anchorId="52045AD5" wp14:editId="269E286B">
             <wp:extent cx="5943600" cy="2542540"/>
@@ -3521,8 +3778,8 @@
       <w:r>
         <w:rPr>
           <w:rFonts w:cstheme="minorHAnsi"/>
-        </w:rPr>
-        <w:lastRenderedPageBreak/>
+          <w:noProof/>
+        </w:rPr>
         <w:drawing>
           <wp:inline distT="0" distB="0" distL="0" distR="0" wp14:anchorId="0F027955" wp14:editId="0E1F724F">
             <wp:extent cx="5943600" cy="2684780"/>
@@ -3648,7 +3905,9 @@
       <w:r>
         <w:rPr>
           <w:rFonts w:cstheme="minorHAnsi"/>
-        </w:rPr>
+          <w:noProof/>
+        </w:rPr>
+        <w:lastRenderedPageBreak/>
         <w:drawing>
           <wp:inline distT="0" distB="0" distL="0" distR="0" wp14:anchorId="7A0108CF" wp14:editId="151A8288">
             <wp:extent cx="5943600" cy="3266440"/>
@@ -3781,19 +4040,7 @@
         <w:rPr>
           <w:rFonts w:cstheme="minorHAnsi"/>
         </w:rPr>
-        <w:t xml:space="preserve"> </w:t>
-      </w:r>
-      <w:r>
-        <w:rPr>
-          <w:rFonts w:cstheme="minorHAnsi"/>
-        </w:rPr>
-        <w:t>in</w:t>
-      </w:r>
-      <w:r>
-        <w:rPr>
-          <w:rFonts w:cstheme="minorHAnsi"/>
-        </w:rPr>
-        <w:t xml:space="preserve">valid </w:t>
+        <w:t xml:space="preserve"> invalid </w:t>
       </w:r>
       <w:proofErr w:type="spellStart"/>
       <w:r>
@@ -3820,8 +4067,8 @@
       <w:r>
         <w:rPr>
           <w:rFonts w:cstheme="minorHAnsi"/>
-        </w:rPr>
-        <w:lastRenderedPageBreak/>
+          <w:noProof/>
+        </w:rPr>
         <w:drawing>
           <wp:inline distT="0" distB="0" distL="0" distR="0" wp14:anchorId="13EBAFB1" wp14:editId="13BA3C77">
             <wp:extent cx="5943600" cy="2769235"/>
@@ -3922,7 +4169,9 @@
       <w:r>
         <w:rPr>
           <w:rFonts w:cstheme="minorHAnsi"/>
-        </w:rPr>
+          <w:noProof/>
+        </w:rPr>
+        <w:lastRenderedPageBreak/>
         <w:drawing>
           <wp:inline distT="0" distB="0" distL="0" distR="0" wp14:anchorId="1301EF06" wp14:editId="540C3E61">
             <wp:extent cx="5943600" cy="2489835"/>
@@ -4100,6 +4349,7 @@
       <w:r>
         <w:rPr>
           <w:rFonts w:cstheme="minorHAnsi"/>
+          <w:noProof/>
         </w:rPr>
         <w:lastRenderedPageBreak/>
         <w:drawing>
@@ -4261,6 +4511,7 @@
       <w:r>
         <w:rPr>
           <w:rFonts w:cstheme="minorHAnsi"/>
+          <w:noProof/>
         </w:rPr>
         <w:lastRenderedPageBreak/>
         <w:drawing>
@@ -4374,6 +4625,7 @@
       <w:r>
         <w:rPr>
           <w:rFonts w:cstheme="minorHAnsi"/>
+          <w:noProof/>
         </w:rPr>
         <w:drawing>
           <wp:inline distT="0" distB="0" distL="0" distR="0" wp14:anchorId="3AB27638" wp14:editId="27435B28">
@@ -4543,6 +4795,7 @@
       <w:r>
         <w:rPr>
           <w:rFonts w:cstheme="minorHAnsi"/>
+          <w:noProof/>
         </w:rPr>
         <w:lastRenderedPageBreak/>
         <w:drawing>
@@ -4653,6 +4906,7 @@
       <w:r>
         <w:rPr>
           <w:rFonts w:cstheme="minorHAnsi"/>
+          <w:noProof/>
         </w:rPr>
         <w:drawing>
           <wp:inline distT="0" distB="0" distL="0" distR="0" wp14:anchorId="54C27F14" wp14:editId="17B57327">
@@ -4833,6 +5087,7 @@
       <w:r>
         <w:rPr>
           <w:rFonts w:cstheme="minorHAnsi"/>
+          <w:noProof/>
         </w:rPr>
         <w:drawing>
           <wp:inline distT="0" distB="0" distL="0" distR="0" wp14:anchorId="18020F79" wp14:editId="3EFAFF49">
@@ -4943,6 +5198,7 @@
       <w:r>
         <w:rPr>
           <w:rFonts w:cstheme="minorHAnsi"/>
+          <w:noProof/>
         </w:rPr>
         <w:drawing>
           <wp:inline distT="0" distB="0" distL="0" distR="0" wp14:anchorId="74C8DCBC" wp14:editId="107D8021">
@@ -5151,6 +5407,7 @@
       <w:r>
         <w:rPr>
           <w:rFonts w:cstheme="minorHAnsi"/>
+          <w:noProof/>
         </w:rPr>
         <w:drawing>
           <wp:inline distT="0" distB="0" distL="0" distR="0" wp14:anchorId="08738BAD" wp14:editId="524867DA">
@@ -5274,6 +5531,7 @@
       <w:r>
         <w:rPr>
           <w:rFonts w:cstheme="minorHAnsi"/>
+          <w:noProof/>
         </w:rPr>
         <w:lastRenderedPageBreak/>
         <w:drawing>
@@ -5449,6 +5707,7 @@
       <w:r>
         <w:rPr>
           <w:rFonts w:cstheme="minorHAnsi"/>
+          <w:noProof/>
         </w:rPr>
         <w:drawing>
           <wp:inline distT="0" distB="0" distL="0" distR="0" wp14:anchorId="02063AC8" wp14:editId="758BC4F6">
@@ -5629,6 +5888,7 @@
       <w:r>
         <w:rPr>
           <w:rFonts w:cstheme="minorHAnsi"/>
+          <w:noProof/>
         </w:rPr>
         <w:lastRenderedPageBreak/>
         <w:drawing>
@@ -5675,7 +5935,7 @@
           <w:rFonts w:asciiTheme="minorHAnsi" w:hAnsiTheme="minorHAnsi" w:cstheme="minorHAnsi"/>
         </w:rPr>
       </w:pPr>
-      <w:bookmarkStart w:id="4" w:name="_Toc234813819"/>
+      <w:bookmarkStart w:id="5" w:name="_Toc235545203"/>
       <w:r>
         <w:rPr>
           <w:rFonts w:asciiTheme="minorHAnsi" w:hAnsiTheme="minorHAnsi" w:cstheme="minorHAnsi"/>
@@ -5696,7 +5956,7 @@
         </w:rPr>
         <w:t xml:space="preserve"> de date</w:t>
       </w:r>
-      <w:bookmarkEnd w:id="4"/>
+      <w:bookmarkEnd w:id="5"/>
     </w:p>
     <w:p>
       <w:pPr>
@@ -5857,7 +6117,7 @@
           <w:rFonts w:asciiTheme="minorHAnsi" w:hAnsiTheme="minorHAnsi" w:cstheme="minorHAnsi"/>
         </w:rPr>
       </w:pPr>
-      <w:bookmarkStart w:id="5" w:name="_Toc234813820"/>
+      <w:bookmarkStart w:id="6" w:name="_Toc235545204"/>
       <w:proofErr w:type="spellStart"/>
       <w:r>
         <w:rPr>
@@ -5865,7 +6125,7 @@
         </w:rPr>
         <w:t>Articole</w:t>
       </w:r>
-      <w:bookmarkEnd w:id="5"/>
+      <w:bookmarkEnd w:id="6"/>
       <w:proofErr w:type="spellEnd"/>
     </w:p>
     <w:p>
@@ -6161,6 +6421,1913 @@
           <w:t>https://marconak-matej.medium.com/mms-boot-notes-documenting-spring-boot-apis-springdoc-openapi-takes-the-lead-1c9863c8f685</w:t>
         </w:r>
       </w:hyperlink>
+    </w:p>
+    <w:p>
+      <w:pPr>
+        <w:pStyle w:val="ListParagraph"/>
+        <w:numPr>
+          <w:ilvl w:val="0"/>
+          <w:numId w:val="2"/>
+        </w:numPr>
+        <w:rPr>
+          <w:rFonts w:cstheme="minorHAnsi"/>
+        </w:rPr>
+      </w:pPr>
+      <w:hyperlink r:id="rId36" w:history="1">
+        <w:r>
+          <w:rPr>
+            <w:rStyle w:val="Hyperlink"/>
+            <w:rFonts w:cstheme="minorHAnsi"/>
+          </w:rPr>
+          <w:t>https://www.baeldung.com/hibernate-identifiers</w:t>
+        </w:r>
+      </w:hyperlink>
+    </w:p>
+    <w:p>
+      <w:pPr>
+        <w:ind w:left="360"/>
+        <w:rPr>
+          <w:rFonts w:cstheme="minorHAnsi"/>
+        </w:rPr>
+      </w:pPr>
+    </w:p>
+    <w:p>
+      <w:pPr>
+        <w:pStyle w:val="Heading1"/>
+      </w:pPr>
+      <w:bookmarkStart w:id="7" w:name="_Toc235545205"/>
+      <w:r>
+        <w:t>Review</w:t>
+      </w:r>
+      <w:bookmarkEnd w:id="7"/>
+    </w:p>
+    <w:p>
+      <w:pPr>
+        <w:pStyle w:val="Heading2"/>
+      </w:pPr>
+      <w:bookmarkStart w:id="8" w:name="_Toc235545206"/>
+      <w:r>
+        <w:t>#1 20.07.2026</w:t>
+      </w:r>
+      <w:bookmarkEnd w:id="8"/>
+    </w:p>
+    <w:p>
+      <w:r>
+        <w:t xml:space="preserve">Dupa </w:t>
+      </w:r>
+      <w:proofErr w:type="spellStart"/>
+      <w:r>
+        <w:t>primul</w:t>
+      </w:r>
+      <w:proofErr w:type="spellEnd"/>
+      <w:r>
+        <w:t xml:space="preserve"> pass, las </w:t>
+      </w:r>
+      <w:proofErr w:type="spellStart"/>
+      <w:r>
+        <w:t>si</w:t>
+      </w:r>
+      <w:proofErr w:type="spellEnd"/>
+      <w:r>
+        <w:t xml:space="preserve"> </w:t>
+      </w:r>
+      <w:proofErr w:type="spellStart"/>
+      <w:r>
+        <w:t>cateva</w:t>
+      </w:r>
+      <w:proofErr w:type="spellEnd"/>
+      <w:r>
+        <w:t xml:space="preserve"> </w:t>
+      </w:r>
+      <w:proofErr w:type="spellStart"/>
+      <w:r>
+        <w:t>observatii</w:t>
+      </w:r>
+      <w:proofErr w:type="spellEnd"/>
+      <w:r>
+        <w:t xml:space="preserve"> </w:t>
+      </w:r>
+      <w:proofErr w:type="spellStart"/>
+      <w:r>
+        <w:t>punctuale</w:t>
+      </w:r>
+      <w:proofErr w:type="spellEnd"/>
+      <w:r>
+        <w:t xml:space="preserve"> </w:t>
+      </w:r>
+      <w:proofErr w:type="spellStart"/>
+      <w:r>
+        <w:t>pentru</w:t>
+      </w:r>
+      <w:proofErr w:type="spellEnd"/>
+      <w:r>
+        <w:t xml:space="preserve"> </w:t>
+      </w:r>
+      <w:proofErr w:type="spellStart"/>
+      <w:r>
+        <w:t>ce</w:t>
+      </w:r>
+      <w:proofErr w:type="spellEnd"/>
+      <w:r>
+        <w:t xml:space="preserve"> </w:t>
+      </w:r>
+      <w:proofErr w:type="spellStart"/>
+      <w:r>
+        <w:t>exista</w:t>
+      </w:r>
+      <w:proofErr w:type="spellEnd"/>
+      <w:r>
+        <w:t xml:space="preserve"> </w:t>
+      </w:r>
+      <w:proofErr w:type="spellStart"/>
+      <w:r>
+        <w:t>deja</w:t>
+      </w:r>
+      <w:proofErr w:type="spellEnd"/>
+      <w:r>
+        <w:t>.</w:t>
+      </w:r>
+    </w:p>
+    <w:p>
+      <w:pPr>
+        <w:numPr>
+          <w:ilvl w:val="0"/>
+          <w:numId w:val="7"/>
+        </w:numPr>
+      </w:pPr>
+      <w:r>
+        <w:t xml:space="preserve">Research </w:t>
+      </w:r>
+      <w:proofErr w:type="spellStart"/>
+      <w:r>
+        <w:t>te</w:t>
+      </w:r>
+      <w:proofErr w:type="spellEnd"/>
+      <w:r>
+        <w:t xml:space="preserve"> rog entity tracking in </w:t>
+      </w:r>
+      <w:proofErr w:type="spellStart"/>
+      <w:r>
+        <w:t>contextul</w:t>
+      </w:r>
+      <w:proofErr w:type="spellEnd"/>
+      <w:r>
+        <w:t xml:space="preserve"> </w:t>
+      </w:r>
+      <w:proofErr w:type="spellStart"/>
+      <w:r>
+        <w:t>transactiior</w:t>
+      </w:r>
+      <w:proofErr w:type="spellEnd"/>
+      <w:r>
+        <w:t xml:space="preserve">, </w:t>
+      </w:r>
+      <w:proofErr w:type="spellStart"/>
+      <w:r>
+        <w:t>si</w:t>
+      </w:r>
+      <w:proofErr w:type="spellEnd"/>
+      <w:r>
+        <w:t xml:space="preserve"> </w:t>
+      </w:r>
+      <w:proofErr w:type="spellStart"/>
+      <w:r>
+        <w:t>adreseaza</w:t>
+      </w:r>
+      <w:proofErr w:type="spellEnd"/>
+      <w:r>
+        <w:t xml:space="preserve"> </w:t>
+      </w:r>
+      <w:proofErr w:type="spellStart"/>
+      <w:r>
+        <w:t>situatiile</w:t>
+      </w:r>
+      <w:proofErr w:type="spellEnd"/>
+      <w:r>
+        <w:t xml:space="preserve"> </w:t>
+      </w:r>
+      <w:proofErr w:type="spellStart"/>
+      <w:r>
+        <w:t>unde</w:t>
+      </w:r>
+      <w:proofErr w:type="spellEnd"/>
+      <w:r>
+        <w:t xml:space="preserve"> se face </w:t>
+      </w:r>
+      <w:proofErr w:type="gramStart"/>
+      <w:r>
+        <w:t>save</w:t>
+      </w:r>
+      <w:proofErr w:type="gramEnd"/>
+      <w:r>
+        <w:t xml:space="preserve"> </w:t>
+      </w:r>
+      <w:proofErr w:type="spellStart"/>
+      <w:r>
+        <w:t>fara</w:t>
+      </w:r>
+      <w:proofErr w:type="spellEnd"/>
+      <w:r>
+        <w:t xml:space="preserve"> a fi </w:t>
+      </w:r>
+      <w:proofErr w:type="spellStart"/>
+      <w:r>
+        <w:t>necesar</w:t>
+      </w:r>
+      <w:proofErr w:type="spellEnd"/>
+      <w:r>
+        <w:t>.</w:t>
+      </w:r>
+    </w:p>
+    <w:p>
+      <w:pPr>
+        <w:numPr>
+          <w:ilvl w:val="0"/>
+          <w:numId w:val="7"/>
+        </w:numPr>
+      </w:pPr>
+      <w:proofErr w:type="spellStart"/>
+      <w:r>
+        <w:t>Shimbare</w:t>
+      </w:r>
+      <w:proofErr w:type="spellEnd"/>
+      <w:r>
+        <w:t xml:space="preserve"> </w:t>
+      </w:r>
+      <w:proofErr w:type="spellStart"/>
+      <w:r>
+        <w:t>varianta</w:t>
+      </w:r>
+      <w:proofErr w:type="spellEnd"/>
+      <w:r>
+        <w:t xml:space="preserve"> </w:t>
+      </w:r>
+      <w:proofErr w:type="spellStart"/>
+      <w:r>
+        <w:t>pentru</w:t>
+      </w:r>
+      <w:proofErr w:type="spellEnd"/>
+      <w:r>
+        <w:t xml:space="preserve"> logging </w:t>
+      </w:r>
+      <w:proofErr w:type="spellStart"/>
+      <w:r>
+        <w:t>sa</w:t>
+      </w:r>
+      <w:proofErr w:type="spellEnd"/>
+      <w:r>
+        <w:t xml:space="preserve"> fie prod ready. (</w:t>
+      </w:r>
+      <w:proofErr w:type="spellStart"/>
+      <w:proofErr w:type="gramStart"/>
+      <w:r>
+        <w:t>IO.println</w:t>
+      </w:r>
+      <w:proofErr w:type="spellEnd"/>
+      <w:proofErr w:type="gramEnd"/>
+      <w:r>
+        <w:t xml:space="preserve">, although </w:t>
+      </w:r>
+      <w:proofErr w:type="spellStart"/>
+      <w:r>
+        <w:t>frumos</w:t>
+      </w:r>
+      <w:proofErr w:type="spellEnd"/>
+      <w:r>
+        <w:t xml:space="preserve"> </w:t>
+      </w:r>
+      <w:proofErr w:type="spellStart"/>
+      <w:r>
+        <w:t>noul</w:t>
+      </w:r>
+      <w:proofErr w:type="spellEnd"/>
+      <w:r>
+        <w:t xml:space="preserve"> shorthand, </w:t>
+      </w:r>
+      <w:proofErr w:type="spellStart"/>
+      <w:r>
+        <w:t>mesajul</w:t>
+      </w:r>
+      <w:proofErr w:type="spellEnd"/>
+      <w:r>
+        <w:t xml:space="preserve"> </w:t>
+      </w:r>
+      <w:proofErr w:type="spellStart"/>
+      <w:r>
+        <w:t>ramane</w:t>
+      </w:r>
+      <w:proofErr w:type="spellEnd"/>
+      <w:r>
+        <w:t xml:space="preserve"> in </w:t>
+      </w:r>
+      <w:proofErr w:type="spellStart"/>
+      <w:r>
+        <w:t>consola</w:t>
+      </w:r>
+      <w:proofErr w:type="spellEnd"/>
+      <w:r>
+        <w:t xml:space="preserve"> </w:t>
+      </w:r>
+      <w:proofErr w:type="spellStart"/>
+      <w:r>
+        <w:t>numai</w:t>
+      </w:r>
+      <w:proofErr w:type="spellEnd"/>
+      <w:r>
+        <w:t xml:space="preserve">, </w:t>
+      </w:r>
+      <w:proofErr w:type="spellStart"/>
+      <w:r>
+        <w:t>iar</w:t>
+      </w:r>
+      <w:proofErr w:type="spellEnd"/>
+      <w:r>
+        <w:t xml:space="preserve"> in </w:t>
+      </w:r>
+      <w:proofErr w:type="spellStart"/>
+      <w:r>
+        <w:t>situatia</w:t>
+      </w:r>
+      <w:proofErr w:type="spellEnd"/>
+      <w:r>
+        <w:t xml:space="preserve"> de prod nu </w:t>
+      </w:r>
+      <w:proofErr w:type="spellStart"/>
+      <w:r>
+        <w:t>este</w:t>
+      </w:r>
+      <w:proofErr w:type="spellEnd"/>
+      <w:r>
+        <w:t xml:space="preserve"> </w:t>
+      </w:r>
+      <w:proofErr w:type="spellStart"/>
+      <w:r>
+        <w:t>suficient</w:t>
+      </w:r>
+      <w:proofErr w:type="spellEnd"/>
+      <w:r>
+        <w:t>.</w:t>
+      </w:r>
+    </w:p>
+    <w:p>
+      <w:pPr>
+        <w:numPr>
+          <w:ilvl w:val="0"/>
+          <w:numId w:val="7"/>
+        </w:numPr>
+      </w:pPr>
+      <w:proofErr w:type="spellStart"/>
+      <w:r>
+        <w:t>Autentificarea</w:t>
+      </w:r>
+      <w:proofErr w:type="spellEnd"/>
+      <w:r>
+        <w:t xml:space="preserve"> pe </w:t>
+      </w:r>
+      <w:proofErr w:type="spellStart"/>
+      <w:r>
+        <w:t>baza</w:t>
+      </w:r>
+      <w:proofErr w:type="spellEnd"/>
+      <w:r>
+        <w:t xml:space="preserve"> de API key </w:t>
+      </w:r>
+      <w:proofErr w:type="spellStart"/>
+      <w:r>
+        <w:t>ar</w:t>
+      </w:r>
+      <w:proofErr w:type="spellEnd"/>
+      <w:r>
+        <w:t xml:space="preserve"> </w:t>
+      </w:r>
+      <w:proofErr w:type="spellStart"/>
+      <w:r>
+        <w:t>trebui</w:t>
+      </w:r>
+      <w:proofErr w:type="spellEnd"/>
+      <w:r>
+        <w:t xml:space="preserve"> </w:t>
+      </w:r>
+      <w:proofErr w:type="spellStart"/>
+      <w:r>
+        <w:t>refactorizata</w:t>
+      </w:r>
+      <w:proofErr w:type="spellEnd"/>
+      <w:r>
+        <w:t xml:space="preserve"> </w:t>
+      </w:r>
+      <w:proofErr w:type="spellStart"/>
+      <w:r>
+        <w:t>intr</w:t>
+      </w:r>
+      <w:proofErr w:type="spellEnd"/>
+      <w:r>
+        <w:t xml:space="preserve">-o </w:t>
+      </w:r>
+      <w:proofErr w:type="spellStart"/>
+      <w:r>
+        <w:t>varianta</w:t>
+      </w:r>
+      <w:proofErr w:type="spellEnd"/>
+      <w:r>
+        <w:t xml:space="preserve"> </w:t>
+      </w:r>
+      <w:proofErr w:type="spellStart"/>
+      <w:r>
+        <w:t>generica</w:t>
+      </w:r>
+      <w:proofErr w:type="spellEnd"/>
+      <w:r>
+        <w:t xml:space="preserve">, </w:t>
+      </w:r>
+      <w:proofErr w:type="spellStart"/>
+      <w:r>
+        <w:t>activa</w:t>
+      </w:r>
+      <w:proofErr w:type="spellEnd"/>
+      <w:r>
+        <w:t xml:space="preserve"> implicit </w:t>
+      </w:r>
+      <w:proofErr w:type="spellStart"/>
+      <w:r>
+        <w:t>pentru</w:t>
+      </w:r>
+      <w:proofErr w:type="spellEnd"/>
+      <w:r>
+        <w:t xml:space="preserve"> </w:t>
+      </w:r>
+      <w:proofErr w:type="spellStart"/>
+      <w:r>
+        <w:t>toate</w:t>
+      </w:r>
+      <w:proofErr w:type="spellEnd"/>
+      <w:r>
+        <w:t xml:space="preserve"> endpoint-urile CRUD </w:t>
+      </w:r>
+      <w:proofErr w:type="spellStart"/>
+      <w:r>
+        <w:t>si</w:t>
+      </w:r>
+      <w:proofErr w:type="spellEnd"/>
+      <w:r>
+        <w:t xml:space="preserve"> </w:t>
+      </w:r>
+      <w:proofErr w:type="spellStart"/>
+      <w:r>
+        <w:t>pentru</w:t>
+      </w:r>
+      <w:proofErr w:type="spellEnd"/>
+      <w:r>
+        <w:t xml:space="preserve"> </w:t>
+      </w:r>
+      <w:proofErr w:type="spellStart"/>
+      <w:r>
+        <w:t>orice</w:t>
+      </w:r>
+      <w:proofErr w:type="spellEnd"/>
+      <w:r>
+        <w:t xml:space="preserve"> alt </w:t>
+      </w:r>
+      <w:proofErr w:type="spellStart"/>
+      <w:r>
+        <w:t>endopint</w:t>
+      </w:r>
+      <w:proofErr w:type="spellEnd"/>
+      <w:r>
+        <w:t xml:space="preserve"> nou </w:t>
+      </w:r>
+      <w:proofErr w:type="spellStart"/>
+      <w:r>
+        <w:t>adaugat</w:t>
+      </w:r>
+      <w:proofErr w:type="spellEnd"/>
+      <w:r>
+        <w:t xml:space="preserve">, cu </w:t>
+      </w:r>
+      <w:proofErr w:type="spellStart"/>
+      <w:r>
+        <w:t>exceptia</w:t>
+      </w:r>
+      <w:proofErr w:type="spellEnd"/>
+      <w:r>
+        <w:t xml:space="preserve"> </w:t>
+      </w:r>
+      <w:proofErr w:type="spellStart"/>
+      <w:r>
+        <w:t>celor</w:t>
+      </w:r>
+      <w:proofErr w:type="spellEnd"/>
+      <w:r>
+        <w:t xml:space="preserve"> </w:t>
+      </w:r>
+      <w:proofErr w:type="spellStart"/>
+      <w:r>
+        <w:t>pentru</w:t>
+      </w:r>
+      <w:proofErr w:type="spellEnd"/>
+      <w:r>
+        <w:t xml:space="preserve"> </w:t>
+      </w:r>
+      <w:proofErr w:type="spellStart"/>
+      <w:r>
+        <w:t>OpenAPI</w:t>
+      </w:r>
+      <w:proofErr w:type="spellEnd"/>
+    </w:p>
+    <w:p>
+      <w:pPr>
+        <w:numPr>
+          <w:ilvl w:val="0"/>
+          <w:numId w:val="7"/>
+        </w:numPr>
+      </w:pPr>
+      <w:proofErr w:type="spellStart"/>
+      <w:r>
+        <w:t>Scos</w:t>
+      </w:r>
+      <w:proofErr w:type="spellEnd"/>
+      <w:r>
+        <w:t xml:space="preserve"> logging API key, ok </w:t>
+      </w:r>
+      <w:proofErr w:type="spellStart"/>
+      <w:r>
+        <w:t>pentru</w:t>
+      </w:r>
+      <w:proofErr w:type="spellEnd"/>
+      <w:r>
+        <w:t xml:space="preserve"> dev, </w:t>
+      </w:r>
+      <w:proofErr w:type="spellStart"/>
+      <w:r>
+        <w:t>dar</w:t>
+      </w:r>
+      <w:proofErr w:type="spellEnd"/>
+      <w:r>
+        <w:t xml:space="preserve"> </w:t>
+      </w:r>
+      <w:proofErr w:type="spellStart"/>
+      <w:r>
+        <w:t>pentru</w:t>
+      </w:r>
+      <w:proofErr w:type="spellEnd"/>
+      <w:r>
+        <w:t xml:space="preserve"> prod </w:t>
+      </w:r>
+      <w:proofErr w:type="spellStart"/>
+      <w:r>
+        <w:t>ar</w:t>
+      </w:r>
+      <w:proofErr w:type="spellEnd"/>
+      <w:r>
+        <w:t xml:space="preserve"> </w:t>
+      </w:r>
+      <w:proofErr w:type="spellStart"/>
+      <w:r>
+        <w:t>trebui</w:t>
+      </w:r>
+      <w:proofErr w:type="spellEnd"/>
+      <w:r>
+        <w:t xml:space="preserve"> conf </w:t>
+      </w:r>
+      <w:proofErr w:type="spellStart"/>
+      <w:r>
+        <w:t>bunelor</w:t>
+      </w:r>
+      <w:proofErr w:type="spellEnd"/>
+      <w:r>
+        <w:t xml:space="preserve"> </w:t>
+      </w:r>
+      <w:proofErr w:type="spellStart"/>
+      <w:r>
+        <w:t>practici</w:t>
+      </w:r>
+      <w:proofErr w:type="spellEnd"/>
+      <w:r>
+        <w:t xml:space="preserve"> (unless </w:t>
+      </w:r>
+      <w:proofErr w:type="spellStart"/>
+      <w:r>
+        <w:t>cineva</w:t>
+      </w:r>
+      <w:proofErr w:type="spellEnd"/>
+      <w:r>
+        <w:t xml:space="preserve"> </w:t>
+      </w:r>
+      <w:proofErr w:type="spellStart"/>
+      <w:r>
+        <w:t>specifica</w:t>
+      </w:r>
+      <w:proofErr w:type="spellEnd"/>
+      <w:r>
+        <w:t xml:space="preserve"> </w:t>
+      </w:r>
+      <w:proofErr w:type="spellStart"/>
+      <w:r>
+        <w:t>diferit</w:t>
+      </w:r>
+      <w:proofErr w:type="spellEnd"/>
+      <w:r>
+        <w:t xml:space="preserve">, </w:t>
+      </w:r>
+      <w:proofErr w:type="spellStart"/>
+      <w:r>
+        <w:t>si</w:t>
+      </w:r>
+      <w:proofErr w:type="spellEnd"/>
+      <w:r>
+        <w:t xml:space="preserve"> se </w:t>
+      </w:r>
+      <w:proofErr w:type="spellStart"/>
+      <w:r>
+        <w:t>asuma</w:t>
+      </w:r>
+      <w:proofErr w:type="spellEnd"/>
+      <w:r>
+        <w:t xml:space="preserve"> </w:t>
+      </w:r>
+      <w:proofErr w:type="spellStart"/>
+      <w:r>
+        <w:t>anuma</w:t>
+      </w:r>
+      <w:proofErr w:type="spellEnd"/>
+      <w:r>
+        <w:t xml:space="preserve"> </w:t>
+      </w:r>
+      <w:proofErr w:type="spellStart"/>
+      <w:r>
+        <w:t>anumite</w:t>
+      </w:r>
+      <w:proofErr w:type="spellEnd"/>
+      <w:r>
+        <w:t xml:space="preserve"> </w:t>
+      </w:r>
+      <w:proofErr w:type="spellStart"/>
+      <w:r>
+        <w:t>riscuri</w:t>
+      </w:r>
+      <w:proofErr w:type="spellEnd"/>
+      <w:r>
+        <w:t>)</w:t>
+      </w:r>
+      <w:r>
+        <w:t xml:space="preserve"> - Done</w:t>
+      </w:r>
+    </w:p>
+    <w:p>
+      <w:pPr>
+        <w:numPr>
+          <w:ilvl w:val="0"/>
+          <w:numId w:val="7"/>
+        </w:numPr>
+      </w:pPr>
+      <w:proofErr w:type="spellStart"/>
+      <w:r>
+        <w:t>Exista</w:t>
+      </w:r>
+      <w:proofErr w:type="spellEnd"/>
+      <w:r>
+        <w:t xml:space="preserve"> un class name typo: </w:t>
+      </w:r>
+      <w:proofErr w:type="spellStart"/>
+      <w:r>
+        <w:t>Permision</w:t>
+      </w:r>
+      <w:proofErr w:type="spellEnd"/>
+      <w:r>
+        <w:t xml:space="preserve"> in loc de Permission</w:t>
+      </w:r>
+      <w:r>
+        <w:t xml:space="preserve"> - Done</w:t>
+      </w:r>
+    </w:p>
+    <w:p>
+      <w:pPr>
+        <w:numPr>
+          <w:ilvl w:val="0"/>
+          <w:numId w:val="7"/>
+        </w:numPr>
+      </w:pPr>
+      <w:r>
+        <w:t xml:space="preserve">In </w:t>
+      </w:r>
+      <w:proofErr w:type="spellStart"/>
+      <w:r>
+        <w:t>modelarea</w:t>
+      </w:r>
+      <w:proofErr w:type="spellEnd"/>
+      <w:r>
+        <w:t xml:space="preserve"> </w:t>
+      </w:r>
+      <w:proofErr w:type="spellStart"/>
+      <w:r>
+        <w:t>entitatilor</w:t>
+      </w:r>
+      <w:proofErr w:type="spellEnd"/>
+      <w:r>
+        <w:t xml:space="preserve">, </w:t>
+      </w:r>
+      <w:proofErr w:type="spellStart"/>
+      <w:r>
+        <w:t>relatia</w:t>
+      </w:r>
+      <w:proofErr w:type="spellEnd"/>
+      <w:r>
+        <w:t xml:space="preserve"> </w:t>
+      </w:r>
+      <w:proofErr w:type="spellStart"/>
+      <w:r>
+        <w:t>dintre</w:t>
+      </w:r>
+      <w:proofErr w:type="spellEnd"/>
+      <w:r>
+        <w:t xml:space="preserve"> Employee </w:t>
+      </w:r>
+      <w:proofErr w:type="spellStart"/>
+      <w:r>
+        <w:t>si</w:t>
+      </w:r>
+      <w:proofErr w:type="spellEnd"/>
+      <w:r>
+        <w:t xml:space="preserve"> Position </w:t>
+      </w:r>
+      <w:proofErr w:type="spellStart"/>
+      <w:r>
+        <w:t>ar</w:t>
+      </w:r>
+      <w:proofErr w:type="spellEnd"/>
+      <w:r>
+        <w:t xml:space="preserve"> </w:t>
+      </w:r>
+      <w:proofErr w:type="spellStart"/>
+      <w:r>
+        <w:t>trebui</w:t>
+      </w:r>
+      <w:proofErr w:type="spellEnd"/>
+      <w:r>
+        <w:t xml:space="preserve"> </w:t>
+      </w:r>
+      <w:proofErr w:type="spellStart"/>
+      <w:r>
+        <w:t>reflectata</w:t>
+      </w:r>
+      <w:proofErr w:type="spellEnd"/>
+      <w:r>
+        <w:t xml:space="preserve"> </w:t>
+      </w:r>
+      <w:proofErr w:type="spellStart"/>
+      <w:r>
+        <w:t>corespunzator</w:t>
+      </w:r>
+      <w:proofErr w:type="spellEnd"/>
+      <w:r>
+        <w:t xml:space="preserve">, </w:t>
+      </w:r>
+      <w:proofErr w:type="spellStart"/>
+      <w:r>
+        <w:t>fara</w:t>
+      </w:r>
+      <w:proofErr w:type="spellEnd"/>
+      <w:r>
+        <w:t xml:space="preserve"> </w:t>
+      </w:r>
+      <w:proofErr w:type="gramStart"/>
+      <w:r>
+        <w:t>a</w:t>
+      </w:r>
+      <w:proofErr w:type="gramEnd"/>
+      <w:r>
+        <w:t xml:space="preserve"> </w:t>
+      </w:r>
+      <w:proofErr w:type="spellStart"/>
+      <w:r>
+        <w:t>incerca</w:t>
+      </w:r>
+      <w:proofErr w:type="spellEnd"/>
+      <w:r>
+        <w:t xml:space="preserve"> date </w:t>
+      </w:r>
+      <w:proofErr w:type="spellStart"/>
+      <w:r>
+        <w:t>despre</w:t>
+      </w:r>
+      <w:proofErr w:type="spellEnd"/>
+      <w:r>
+        <w:t xml:space="preserve"> </w:t>
+      </w:r>
+      <w:proofErr w:type="spellStart"/>
+      <w:r>
+        <w:t>legaturi</w:t>
+      </w:r>
+      <w:proofErr w:type="spellEnd"/>
+      <w:r>
+        <w:t>.</w:t>
+      </w:r>
+    </w:p>
+    <w:p>
+      <w:pPr>
+        <w:numPr>
+          <w:ilvl w:val="0"/>
+          <w:numId w:val="7"/>
+        </w:numPr>
+      </w:pPr>
+      <w:r>
+        <w:t xml:space="preserve">As </w:t>
+      </w:r>
+      <w:proofErr w:type="spellStart"/>
+      <w:r>
+        <w:t>vrea</w:t>
+      </w:r>
+      <w:proofErr w:type="spellEnd"/>
+      <w:r>
+        <w:t xml:space="preserve"> </w:t>
+      </w:r>
+      <w:proofErr w:type="spellStart"/>
+      <w:r>
+        <w:t>si</w:t>
+      </w:r>
+      <w:proofErr w:type="spellEnd"/>
+      <w:r>
+        <w:t xml:space="preserve"> o </w:t>
+      </w:r>
+      <w:proofErr w:type="spellStart"/>
+      <w:r>
+        <w:t>scurta</w:t>
+      </w:r>
+      <w:proofErr w:type="spellEnd"/>
+      <w:r>
+        <w:t xml:space="preserve"> </w:t>
+      </w:r>
+      <w:proofErr w:type="spellStart"/>
+      <w:r>
+        <w:t>justificare</w:t>
+      </w:r>
+      <w:proofErr w:type="spellEnd"/>
+      <w:r>
+        <w:t xml:space="preserve"> </w:t>
+      </w:r>
+      <w:proofErr w:type="spellStart"/>
+      <w:r>
+        <w:t>pentru</w:t>
+      </w:r>
+      <w:proofErr w:type="spellEnd"/>
+      <w:r>
+        <w:t xml:space="preserve"> </w:t>
+      </w:r>
+      <w:proofErr w:type="spellStart"/>
+      <w:r>
+        <w:t>alegerea</w:t>
+      </w:r>
+      <w:proofErr w:type="spellEnd"/>
+      <w:r>
+        <w:t xml:space="preserve"> SEQUENCE la </w:t>
+      </w:r>
+      <w:proofErr w:type="spellStart"/>
+      <w:r>
+        <w:t>generarea</w:t>
+      </w:r>
+      <w:proofErr w:type="spellEnd"/>
+      <w:r>
+        <w:t xml:space="preserve"> PK, nu </w:t>
+      </w:r>
+      <w:proofErr w:type="spellStart"/>
+      <w:r>
+        <w:t>pentru</w:t>
+      </w:r>
+      <w:proofErr w:type="spellEnd"/>
+      <w:r>
+        <w:t xml:space="preserve"> ca </w:t>
+      </w:r>
+      <w:proofErr w:type="spellStart"/>
+      <w:r>
+        <w:t>este</w:t>
+      </w:r>
+      <w:proofErr w:type="spellEnd"/>
+      <w:r>
+        <w:t xml:space="preserve"> </w:t>
+      </w:r>
+      <w:proofErr w:type="spellStart"/>
+      <w:r>
+        <w:t>gresit</w:t>
+      </w:r>
+      <w:proofErr w:type="spellEnd"/>
+      <w:r>
+        <w:t xml:space="preserve">, ci </w:t>
+      </w:r>
+      <w:proofErr w:type="spellStart"/>
+      <w:r>
+        <w:t>pentru</w:t>
+      </w:r>
+      <w:proofErr w:type="spellEnd"/>
+      <w:r>
+        <w:t xml:space="preserve"> a </w:t>
+      </w:r>
+      <w:proofErr w:type="spellStart"/>
+      <w:r>
+        <w:t>confirma</w:t>
+      </w:r>
+      <w:proofErr w:type="spellEnd"/>
+      <w:r>
+        <w:t xml:space="preserve"> ca ai </w:t>
+      </w:r>
+      <w:proofErr w:type="spellStart"/>
+      <w:r>
+        <w:t>inteles</w:t>
+      </w:r>
+      <w:proofErr w:type="spellEnd"/>
+      <w:r>
+        <w:t xml:space="preserve"> </w:t>
+      </w:r>
+      <w:proofErr w:type="spellStart"/>
+      <w:r>
+        <w:t>rationamentul</w:t>
+      </w:r>
+      <w:proofErr w:type="spellEnd"/>
+      <w:r>
+        <w:t xml:space="preserve"> pros / cons la </w:t>
+      </w:r>
+      <w:proofErr w:type="spellStart"/>
+      <w:r>
+        <w:t>fiecare</w:t>
+      </w:r>
+      <w:proofErr w:type="spellEnd"/>
+      <w:r>
+        <w:t xml:space="preserve"> -Done</w:t>
+      </w:r>
+    </w:p>
+    <w:p>
+      <w:pPr>
+        <w:numPr>
+          <w:ilvl w:val="0"/>
+          <w:numId w:val="7"/>
+        </w:numPr>
+      </w:pPr>
+      <w:proofErr w:type="spellStart"/>
+      <w:r>
+        <w:t>PositionRequest</w:t>
+      </w:r>
+      <w:proofErr w:type="spellEnd"/>
+      <w:r>
+        <w:t xml:space="preserve"> include date </w:t>
+      </w:r>
+      <w:proofErr w:type="spellStart"/>
+      <w:r>
+        <w:t>despre</w:t>
+      </w:r>
+      <w:proofErr w:type="spellEnd"/>
+      <w:r>
+        <w:t xml:space="preserve"> PK, desi sunt </w:t>
+      </w:r>
+      <w:proofErr w:type="spellStart"/>
+      <w:r>
+        <w:t>irelevante</w:t>
+      </w:r>
+      <w:proofErr w:type="spellEnd"/>
+      <w:r>
+        <w:t xml:space="preserve"> in </w:t>
+      </w:r>
+      <w:proofErr w:type="spellStart"/>
+      <w:r>
+        <w:t>contextul</w:t>
+      </w:r>
+      <w:proofErr w:type="spellEnd"/>
+      <w:r>
+        <w:t xml:space="preserve"> in care </w:t>
+      </w:r>
+      <w:proofErr w:type="spellStart"/>
+      <w:r>
+        <w:t>semnatura</w:t>
+      </w:r>
+      <w:proofErr w:type="spellEnd"/>
+      <w:r>
+        <w:t xml:space="preserve"> </w:t>
+      </w:r>
+      <w:proofErr w:type="spellStart"/>
+      <w:r>
+        <w:t>metodei</w:t>
+      </w:r>
+      <w:proofErr w:type="spellEnd"/>
+      <w:r>
+        <w:t xml:space="preserve"> </w:t>
+      </w:r>
+      <w:proofErr w:type="spellStart"/>
+      <w:r>
+        <w:t>pentru</w:t>
+      </w:r>
+      <w:proofErr w:type="spellEnd"/>
+      <w:r>
+        <w:t xml:space="preserve"> update </w:t>
+      </w:r>
+      <w:proofErr w:type="spellStart"/>
+      <w:r>
+        <w:t>specifica</w:t>
+      </w:r>
+      <w:proofErr w:type="spellEnd"/>
+      <w:r>
+        <w:t xml:space="preserve"> in </w:t>
+      </w:r>
+      <w:proofErr w:type="spellStart"/>
+      <w:r>
+        <w:t>clar</w:t>
+      </w:r>
+      <w:proofErr w:type="spellEnd"/>
+      <w:r>
+        <w:t xml:space="preserve"> id-ul ca </w:t>
+      </w:r>
+      <w:proofErr w:type="spellStart"/>
+      <w:r>
+        <w:t>si</w:t>
+      </w:r>
+      <w:proofErr w:type="spellEnd"/>
+      <w:r>
+        <w:t xml:space="preserve"> </w:t>
+      </w:r>
+      <w:proofErr w:type="spellStart"/>
+      <w:r>
+        <w:t>parametru</w:t>
+      </w:r>
+      <w:proofErr w:type="spellEnd"/>
+      <w:r>
+        <w:t xml:space="preserve"> </w:t>
+      </w:r>
+      <w:proofErr w:type="spellStart"/>
+      <w:r>
+        <w:t>diferit</w:t>
+      </w:r>
+      <w:proofErr w:type="spellEnd"/>
+      <w:r>
+        <w:t xml:space="preserve">. A se </w:t>
+      </w:r>
+      <w:proofErr w:type="spellStart"/>
+      <w:r>
+        <w:t>elimina</w:t>
+      </w:r>
+      <w:proofErr w:type="spellEnd"/>
+      <w:r>
+        <w:t xml:space="preserve">, </w:t>
+      </w:r>
+      <w:proofErr w:type="spellStart"/>
+      <w:r>
+        <w:t>poate</w:t>
+      </w:r>
+      <w:proofErr w:type="spellEnd"/>
+      <w:r>
+        <w:t xml:space="preserve"> </w:t>
+      </w:r>
+      <w:proofErr w:type="spellStart"/>
+      <w:r>
+        <w:t>crea</w:t>
+      </w:r>
+      <w:proofErr w:type="spellEnd"/>
+      <w:r>
+        <w:t xml:space="preserve"> </w:t>
+      </w:r>
+      <w:proofErr w:type="spellStart"/>
+      <w:r>
+        <w:t>confuzii</w:t>
+      </w:r>
+      <w:proofErr w:type="spellEnd"/>
+      <w:r>
+        <w:t xml:space="preserve"> ulterior </w:t>
+      </w:r>
+      <w:proofErr w:type="spellStart"/>
+      <w:r>
+        <w:t>pentru</w:t>
+      </w:r>
+      <w:proofErr w:type="spellEnd"/>
+      <w:r>
+        <w:t xml:space="preserve"> alti </w:t>
+      </w:r>
+      <w:proofErr w:type="spellStart"/>
+      <w:r>
+        <w:t>programatori</w:t>
+      </w:r>
+      <w:proofErr w:type="spellEnd"/>
+      <w:r>
+        <w:t xml:space="preserve"> &gt;tine </w:t>
+      </w:r>
+      <w:proofErr w:type="spellStart"/>
+      <w:r>
+        <w:t>cont</w:t>
+      </w:r>
+      <w:proofErr w:type="spellEnd"/>
+      <w:r>
+        <w:t xml:space="preserve"> ca un cod bun </w:t>
+      </w:r>
+      <w:proofErr w:type="spellStart"/>
+      <w:r>
+        <w:t>este</w:t>
+      </w:r>
+      <w:proofErr w:type="spellEnd"/>
+      <w:r>
+        <w:t xml:space="preserve"> un cod care la prima </w:t>
+      </w:r>
+      <w:proofErr w:type="spellStart"/>
+      <w:r>
+        <w:t>vedere</w:t>
+      </w:r>
+      <w:proofErr w:type="spellEnd"/>
+      <w:r>
+        <w:t xml:space="preserve"> </w:t>
+      </w:r>
+      <w:proofErr w:type="spellStart"/>
+      <w:r>
+        <w:t>poti</w:t>
+      </w:r>
+      <w:proofErr w:type="spellEnd"/>
+      <w:r>
+        <w:t xml:space="preserve"> </w:t>
+      </w:r>
+      <w:proofErr w:type="spellStart"/>
+      <w:r>
+        <w:t>sa</w:t>
+      </w:r>
+      <w:proofErr w:type="spellEnd"/>
+      <w:r>
+        <w:t xml:space="preserve"> </w:t>
+      </w:r>
+      <w:proofErr w:type="spellStart"/>
+      <w:r>
+        <w:t>iti</w:t>
+      </w:r>
+      <w:proofErr w:type="spellEnd"/>
+      <w:r>
+        <w:t xml:space="preserve"> </w:t>
+      </w:r>
+      <w:proofErr w:type="spellStart"/>
+      <w:r>
+        <w:t>dai</w:t>
+      </w:r>
+      <w:proofErr w:type="spellEnd"/>
+      <w:r>
+        <w:t xml:space="preserve"> </w:t>
+      </w:r>
+      <w:proofErr w:type="spellStart"/>
+      <w:r>
+        <w:t>seama</w:t>
+      </w:r>
+      <w:proofErr w:type="spellEnd"/>
+      <w:r>
+        <w:t xml:space="preserve"> </w:t>
+      </w:r>
+      <w:proofErr w:type="spellStart"/>
+      <w:r>
+        <w:t>despre</w:t>
+      </w:r>
+      <w:proofErr w:type="spellEnd"/>
+      <w:r>
+        <w:t xml:space="preserve"> </w:t>
+      </w:r>
+      <w:proofErr w:type="spellStart"/>
+      <w:r>
+        <w:t>ce</w:t>
+      </w:r>
+      <w:proofErr w:type="spellEnd"/>
+      <w:r>
+        <w:t xml:space="preserve"> </w:t>
+      </w:r>
+      <w:proofErr w:type="spellStart"/>
+      <w:r>
+        <w:t>este</w:t>
+      </w:r>
+      <w:proofErr w:type="spellEnd"/>
+      <w:r>
+        <w:t xml:space="preserve"> </w:t>
+      </w:r>
+      <w:proofErr w:type="spellStart"/>
+      <w:r>
+        <w:t>vorba</w:t>
+      </w:r>
+      <w:proofErr w:type="spellEnd"/>
+      <w:r>
+        <w:t>&lt;</w:t>
+      </w:r>
+    </w:p>
+    <w:p>
+      <w:pPr>
+        <w:numPr>
+          <w:ilvl w:val="0"/>
+          <w:numId w:val="7"/>
+        </w:numPr>
+      </w:pPr>
+      <w:proofErr w:type="spellStart"/>
+      <w:r>
+        <w:t>Ar</w:t>
+      </w:r>
+      <w:proofErr w:type="spellEnd"/>
+      <w:r>
+        <w:t xml:space="preserve"> fi </w:t>
+      </w:r>
+      <w:proofErr w:type="spellStart"/>
+      <w:r>
+        <w:t>foarte</w:t>
+      </w:r>
+      <w:proofErr w:type="spellEnd"/>
+      <w:r>
+        <w:t xml:space="preserve"> util </w:t>
+      </w:r>
+      <w:proofErr w:type="spellStart"/>
+      <w:r>
+        <w:t>sa</w:t>
+      </w:r>
+      <w:proofErr w:type="spellEnd"/>
+      <w:r>
+        <w:t xml:space="preserve"> </w:t>
+      </w:r>
+      <w:proofErr w:type="spellStart"/>
+      <w:r>
+        <w:t>faci</w:t>
+      </w:r>
+      <w:proofErr w:type="spellEnd"/>
+      <w:r>
+        <w:t xml:space="preserve"> ca </w:t>
+      </w:r>
+      <w:proofErr w:type="spellStart"/>
+      <w:r>
+        <w:t>ultim</w:t>
+      </w:r>
+      <w:proofErr w:type="spellEnd"/>
+      <w:r>
+        <w:t xml:space="preserve"> pass, o </w:t>
+      </w:r>
+      <w:proofErr w:type="spellStart"/>
+      <w:r>
+        <w:t>analiza</w:t>
+      </w:r>
+      <w:proofErr w:type="spellEnd"/>
+      <w:r>
+        <w:t xml:space="preserve"> cu SonarQube (se </w:t>
+      </w:r>
+      <w:proofErr w:type="spellStart"/>
+      <w:r>
+        <w:t>poate</w:t>
+      </w:r>
+      <w:proofErr w:type="spellEnd"/>
+      <w:r>
+        <w:t xml:space="preserve"> </w:t>
+      </w:r>
+      <w:proofErr w:type="spellStart"/>
+      <w:r>
+        <w:t>activa</w:t>
+      </w:r>
+      <w:proofErr w:type="spellEnd"/>
+      <w:r>
+        <w:t xml:space="preserve"> ca </w:t>
+      </w:r>
+      <w:proofErr w:type="spellStart"/>
+      <w:r>
+        <w:t>inainte</w:t>
+      </w:r>
+      <w:proofErr w:type="spellEnd"/>
+      <w:r>
+        <w:t xml:space="preserve"> de commit </w:t>
+      </w:r>
+      <w:proofErr w:type="spellStart"/>
+      <w:r>
+        <w:t>sa</w:t>
+      </w:r>
+      <w:proofErr w:type="spellEnd"/>
+      <w:r>
+        <w:t xml:space="preserve"> </w:t>
+      </w:r>
+      <w:proofErr w:type="spellStart"/>
+      <w:r>
+        <w:t>faca</w:t>
+      </w:r>
+      <w:proofErr w:type="spellEnd"/>
+      <w:r>
+        <w:t xml:space="preserve"> trigger </w:t>
+      </w:r>
+      <w:proofErr w:type="spellStart"/>
+      <w:r>
+        <w:t>Intellij</w:t>
+      </w:r>
+      <w:proofErr w:type="spellEnd"/>
+      <w:r>
+        <w:t>).</w:t>
+      </w:r>
+    </w:p>
+    <w:p/>
+    <w:p>
+      <w:pPr>
+        <w:pStyle w:val="Heading1"/>
+      </w:pPr>
+      <w:bookmarkStart w:id="9" w:name="_Toc235545207"/>
+      <w:proofErr w:type="spellStart"/>
+      <w:r>
+        <w:lastRenderedPageBreak/>
+        <w:t>Justificare</w:t>
+      </w:r>
+      <w:proofErr w:type="spellEnd"/>
+      <w:r>
+        <w:t xml:space="preserve"> </w:t>
+      </w:r>
+      <w:r>
+        <w:t>Sequence</w:t>
+      </w:r>
+      <w:bookmarkEnd w:id="9"/>
+    </w:p>
+    <w:p/>
+    <w:p>
+      <w:proofErr w:type="spellStart"/>
+      <w:r>
+        <w:t>Optiunile</w:t>
+      </w:r>
+      <w:proofErr w:type="spellEnd"/>
+      <w:r>
+        <w:t xml:space="preserve"> pe care le </w:t>
+      </w:r>
+      <w:proofErr w:type="spellStart"/>
+      <w:r>
+        <w:t>aveam</w:t>
+      </w:r>
+      <w:proofErr w:type="spellEnd"/>
+      <w:r>
+        <w:t xml:space="preserve"> </w:t>
+      </w:r>
+      <w:proofErr w:type="spellStart"/>
+      <w:r>
+        <w:t>disponibile</w:t>
+      </w:r>
+      <w:proofErr w:type="spellEnd"/>
+      <w:r>
+        <w:t xml:space="preserve"> </w:t>
+      </w:r>
+      <w:proofErr w:type="spellStart"/>
+      <w:r>
+        <w:t>erau</w:t>
+      </w:r>
+      <w:proofErr w:type="spellEnd"/>
+      <w:r>
+        <w:t xml:space="preserve"> sequence, identity </w:t>
+      </w:r>
+      <w:proofErr w:type="spellStart"/>
+      <w:r>
+        <w:t>si</w:t>
+      </w:r>
+      <w:proofErr w:type="spellEnd"/>
+      <w:r>
+        <w:t xml:space="preserve"> table. Am ales Sequence </w:t>
+      </w:r>
+      <w:proofErr w:type="spellStart"/>
+      <w:r>
+        <w:t>deoare</w:t>
+      </w:r>
+      <w:r>
+        <w:t>c</w:t>
+      </w:r>
+      <w:r>
+        <w:t>e</w:t>
+      </w:r>
+      <w:proofErr w:type="spellEnd"/>
+      <w:r>
+        <w:t xml:space="preserve"> </w:t>
+      </w:r>
+      <w:proofErr w:type="spellStart"/>
+      <w:r>
+        <w:t>permite</w:t>
+      </w:r>
+      <w:proofErr w:type="spellEnd"/>
+      <w:r>
+        <w:t xml:space="preserve"> </w:t>
+      </w:r>
+      <w:proofErr w:type="spellStart"/>
+      <w:r>
+        <w:t>inserarea</w:t>
+      </w:r>
+      <w:proofErr w:type="spellEnd"/>
+      <w:r>
+        <w:t xml:space="preserve"> in batch-</w:t>
+      </w:r>
+      <w:proofErr w:type="spellStart"/>
+      <w:r>
+        <w:t>uri</w:t>
+      </w:r>
+      <w:proofErr w:type="spellEnd"/>
+      <w:r>
+        <w:t xml:space="preserve"> fata de Identity. Daca </w:t>
+      </w:r>
+      <w:proofErr w:type="spellStart"/>
+      <w:r>
+        <w:t>foloseam</w:t>
+      </w:r>
+      <w:proofErr w:type="spellEnd"/>
+      <w:r>
+        <w:t xml:space="preserve"> </w:t>
+      </w:r>
+      <w:proofErr w:type="gramStart"/>
+      <w:r>
+        <w:t>identity ,</w:t>
+      </w:r>
+      <w:proofErr w:type="spellStart"/>
+      <w:r>
+        <w:t>baza</w:t>
+      </w:r>
+      <w:proofErr w:type="spellEnd"/>
+      <w:proofErr w:type="gramEnd"/>
+      <w:r>
+        <w:t xml:space="preserve"> de date genera id ul </w:t>
+      </w:r>
+      <w:proofErr w:type="spellStart"/>
+      <w:r>
+        <w:t>doar</w:t>
+      </w:r>
+      <w:proofErr w:type="spellEnd"/>
+      <w:r>
+        <w:t xml:space="preserve"> in </w:t>
+      </w:r>
+      <w:proofErr w:type="spellStart"/>
+      <w:r>
+        <w:t>momentul</w:t>
+      </w:r>
+      <w:proofErr w:type="spellEnd"/>
+      <w:r>
+        <w:t xml:space="preserve"> </w:t>
+      </w:r>
+      <w:proofErr w:type="spellStart"/>
+      <w:r>
+        <w:t>inserarii</w:t>
+      </w:r>
+      <w:proofErr w:type="spellEnd"/>
+      <w:r>
+        <w:t xml:space="preserve">. Cu sequence </w:t>
+      </w:r>
+      <w:proofErr w:type="spellStart"/>
+      <w:r>
+        <w:t>baza</w:t>
+      </w:r>
+      <w:proofErr w:type="spellEnd"/>
+      <w:r>
+        <w:t xml:space="preserve"> de date </w:t>
+      </w:r>
+      <w:proofErr w:type="spellStart"/>
+      <w:r>
+        <w:t>poate</w:t>
+      </w:r>
+      <w:proofErr w:type="spellEnd"/>
+      <w:r>
+        <w:t xml:space="preserve"> genera in </w:t>
+      </w:r>
+      <w:proofErr w:type="spellStart"/>
+      <w:r>
+        <w:t>avans</w:t>
+      </w:r>
+      <w:proofErr w:type="spellEnd"/>
+      <w:r>
+        <w:t xml:space="preserve"> id urile </w:t>
+      </w:r>
+      <w:proofErr w:type="spellStart"/>
+      <w:r>
+        <w:t>si</w:t>
+      </w:r>
+      <w:proofErr w:type="spellEnd"/>
+      <w:r>
+        <w:t xml:space="preserve"> </w:t>
+      </w:r>
+      <w:proofErr w:type="spellStart"/>
+      <w:r>
+        <w:t>sa</w:t>
+      </w:r>
+      <w:proofErr w:type="spellEnd"/>
+      <w:r>
+        <w:t xml:space="preserve"> le </w:t>
+      </w:r>
+      <w:proofErr w:type="spellStart"/>
+      <w:r>
+        <w:t>foloseaca</w:t>
+      </w:r>
+      <w:proofErr w:type="spellEnd"/>
+      <w:r>
+        <w:t xml:space="preserve"> in </w:t>
+      </w:r>
+      <w:proofErr w:type="spellStart"/>
+      <w:r>
+        <w:t>momentul</w:t>
+      </w:r>
+      <w:proofErr w:type="spellEnd"/>
+      <w:r>
+        <w:t xml:space="preserve"> </w:t>
+      </w:r>
+      <w:proofErr w:type="spellStart"/>
+      <w:r>
+        <w:t>inserarii</w:t>
+      </w:r>
+      <w:proofErr w:type="spellEnd"/>
+      <w:r>
+        <w:t>.</w:t>
+      </w:r>
+    </w:p>
+    <w:p>
+      <w:pPr>
+        <w:pStyle w:val="ListParagraph"/>
+        <w:numPr>
+          <w:ilvl w:val="0"/>
+          <w:numId w:val="7"/>
+        </w:numPr>
+      </w:pPr>
+      <w:r>
+        <w:t>Sequence</w:t>
+      </w:r>
+    </w:p>
+    <w:tbl>
+      <w:tblPr>
+        <w:tblStyle w:val="TableGrid"/>
+        <w:tblW w:w="0" w:type="auto"/>
+        <w:tblInd w:w="625" w:type="dxa"/>
+        <w:tblLook w:val="04A0" w:firstRow="1" w:lastRow="0" w:firstColumn="1" w:lastColumn="0" w:noHBand="0" w:noVBand="1"/>
+      </w:tblPr>
+      <w:tblGrid>
+        <w:gridCol w:w="4412"/>
+        <w:gridCol w:w="4313"/>
+      </w:tblGrid>
+      <w:tr>
+        <w:tc>
+          <w:tcPr>
+            <w:tcW w:w="4412" w:type="dxa"/>
+          </w:tcPr>
+          <w:p>
+            <w:pPr>
+              <w:pStyle w:val="ListParagraph"/>
+              <w:ind w:left="0"/>
+              <w:jc w:val="center"/>
+            </w:pPr>
+            <w:r>
+              <w:t>Pro</w:t>
+            </w:r>
+          </w:p>
+        </w:tc>
+        <w:tc>
+          <w:tcPr>
+            <w:tcW w:w="4313" w:type="dxa"/>
+          </w:tcPr>
+          <w:p>
+            <w:pPr>
+              <w:pStyle w:val="ListParagraph"/>
+              <w:ind w:left="0"/>
+              <w:jc w:val="center"/>
+            </w:pPr>
+            <w:r>
+              <w:t>contra</w:t>
+            </w:r>
+          </w:p>
+        </w:tc>
+      </w:tr>
+      <w:tr>
+        <w:tc>
+          <w:tcPr>
+            <w:tcW w:w="4412" w:type="dxa"/>
+          </w:tcPr>
+          <w:p>
+            <w:pPr>
+              <w:pStyle w:val="ListParagraph"/>
+              <w:ind w:left="0"/>
+            </w:pPr>
+            <w:proofErr w:type="spellStart"/>
+            <w:r>
+              <w:t>Rapiditate</w:t>
+            </w:r>
+            <w:proofErr w:type="spellEnd"/>
+            <w:r>
+              <w:t xml:space="preserve"> la </w:t>
+            </w:r>
+            <w:proofErr w:type="spellStart"/>
+            <w:r>
+              <w:t>inserare</w:t>
+            </w:r>
+            <w:proofErr w:type="spellEnd"/>
+            <w:r>
+              <w:t xml:space="preserve"> </w:t>
+            </w:r>
+            <w:proofErr w:type="spellStart"/>
+            <w:r>
+              <w:t>prin</w:t>
+            </w:r>
+            <w:proofErr w:type="spellEnd"/>
+            <w:r>
+              <w:t xml:space="preserve"> </w:t>
+            </w:r>
+            <w:proofErr w:type="spellStart"/>
+            <w:r>
+              <w:t>utilizarea</w:t>
+            </w:r>
+            <w:proofErr w:type="spellEnd"/>
+            <w:r>
+              <w:t xml:space="preserve"> batch </w:t>
+            </w:r>
+            <w:proofErr w:type="spellStart"/>
+            <w:r>
+              <w:t>urilor</w:t>
+            </w:r>
+            <w:proofErr w:type="spellEnd"/>
+          </w:p>
+        </w:tc>
+        <w:tc>
+          <w:tcPr>
+            <w:tcW w:w="4313" w:type="dxa"/>
+          </w:tcPr>
+          <w:p>
+            <w:pPr>
+              <w:pStyle w:val="ListParagraph"/>
+              <w:ind w:left="0"/>
+            </w:pPr>
+            <w:r>
+              <w:t xml:space="preserve">Daca </w:t>
+            </w:r>
+            <w:proofErr w:type="spellStart"/>
+            <w:r>
+              <w:t>e</w:t>
+            </w:r>
+            <w:r>
+              <w:t>sueaza</w:t>
+            </w:r>
+            <w:proofErr w:type="spellEnd"/>
+            <w:r>
+              <w:t xml:space="preserve"> o </w:t>
+            </w:r>
+            <w:proofErr w:type="spellStart"/>
+            <w:r>
+              <w:t>tranzactie</w:t>
+            </w:r>
+            <w:proofErr w:type="spellEnd"/>
+            <w:r>
+              <w:t xml:space="preserve"> id urile </w:t>
+            </w:r>
+            <w:proofErr w:type="spellStart"/>
+            <w:r>
+              <w:t>prealocate</w:t>
+            </w:r>
+            <w:proofErr w:type="spellEnd"/>
+            <w:r>
+              <w:t xml:space="preserve"> se </w:t>
+            </w:r>
+            <w:proofErr w:type="spellStart"/>
+            <w:r>
+              <w:t>pierd</w:t>
+            </w:r>
+            <w:proofErr w:type="spellEnd"/>
+            <w:r>
+              <w:t xml:space="preserve"> </w:t>
+            </w:r>
+            <w:proofErr w:type="spellStart"/>
+            <w:r>
+              <w:t>si</w:t>
+            </w:r>
+            <w:proofErr w:type="spellEnd"/>
+            <w:r>
+              <w:t xml:space="preserve"> o </w:t>
+            </w:r>
+            <w:proofErr w:type="spellStart"/>
+            <w:r>
+              <w:t>sa</w:t>
+            </w:r>
+            <w:proofErr w:type="spellEnd"/>
+            <w:r>
+              <w:t xml:space="preserve"> fie </w:t>
+            </w:r>
+            <w:proofErr w:type="spellStart"/>
+            <w:r>
+              <w:t>salturi</w:t>
+            </w:r>
+            <w:proofErr w:type="spellEnd"/>
+            <w:r>
+              <w:t xml:space="preserve"> </w:t>
+            </w:r>
+            <w:proofErr w:type="spellStart"/>
+            <w:r>
+              <w:t>mari</w:t>
+            </w:r>
+            <w:proofErr w:type="spellEnd"/>
+            <w:r>
+              <w:t xml:space="preserve"> </w:t>
+            </w:r>
+            <w:r>
+              <w:t xml:space="preserve">la id </w:t>
+            </w:r>
+            <w:proofErr w:type="spellStart"/>
+            <w:r>
+              <w:t>uri</w:t>
+            </w:r>
+            <w:proofErr w:type="spellEnd"/>
+          </w:p>
+        </w:tc>
+      </w:tr>
+    </w:tbl>
+    <w:p>
+      <w:pPr>
+        <w:pStyle w:val="ListParagraph"/>
+      </w:pPr>
+    </w:p>
+    <w:p>
+      <w:pPr>
+        <w:pStyle w:val="ListParagraph"/>
+        <w:numPr>
+          <w:ilvl w:val="0"/>
+          <w:numId w:val="7"/>
+        </w:numPr>
+      </w:pPr>
+      <w:r>
+        <w:t>Identity</w:t>
+      </w:r>
+    </w:p>
+    <w:tbl>
+      <w:tblPr>
+        <w:tblStyle w:val="TableGrid"/>
+        <w:tblW w:w="0" w:type="auto"/>
+        <w:tblInd w:w="625" w:type="dxa"/>
+        <w:tblLook w:val="04A0" w:firstRow="1" w:lastRow="0" w:firstColumn="1" w:lastColumn="0" w:noHBand="0" w:noVBand="1"/>
+      </w:tblPr>
+      <w:tblGrid>
+        <w:gridCol w:w="4412"/>
+        <w:gridCol w:w="4138"/>
+      </w:tblGrid>
+      <w:tr>
+        <w:tc>
+          <w:tcPr>
+            <w:tcW w:w="4412" w:type="dxa"/>
+          </w:tcPr>
+          <w:p>
+            <w:pPr>
+              <w:pStyle w:val="ListParagraph"/>
+              <w:ind w:left="0"/>
+              <w:jc w:val="center"/>
+            </w:pPr>
+            <w:r>
+              <w:t>Pro</w:t>
+            </w:r>
+          </w:p>
+        </w:tc>
+        <w:tc>
+          <w:tcPr>
+            <w:tcW w:w="4138" w:type="dxa"/>
+          </w:tcPr>
+          <w:p>
+            <w:pPr>
+              <w:pStyle w:val="ListParagraph"/>
+              <w:ind w:left="0"/>
+              <w:jc w:val="center"/>
+            </w:pPr>
+            <w:r>
+              <w:t>contra</w:t>
+            </w:r>
+          </w:p>
+        </w:tc>
+      </w:tr>
+      <w:tr>
+        <w:tc>
+          <w:tcPr>
+            <w:tcW w:w="4412" w:type="dxa"/>
+          </w:tcPr>
+          <w:p>
+            <w:pPr>
+              <w:pStyle w:val="ListParagraph"/>
+              <w:ind w:left="0"/>
+            </w:pPr>
+            <w:r>
+              <w:t xml:space="preserve">Daca </w:t>
+            </w:r>
+            <w:proofErr w:type="spellStart"/>
+            <w:r>
+              <w:t>esueaza</w:t>
+            </w:r>
+            <w:proofErr w:type="spellEnd"/>
+            <w:r>
+              <w:t xml:space="preserve"> o </w:t>
+            </w:r>
+            <w:proofErr w:type="spellStart"/>
+            <w:r>
+              <w:t>tranzactie</w:t>
+            </w:r>
+            <w:proofErr w:type="spellEnd"/>
+            <w:r>
+              <w:t xml:space="preserve"> </w:t>
+            </w:r>
+            <w:proofErr w:type="spellStart"/>
+            <w:r>
+              <w:t>salturile</w:t>
+            </w:r>
+            <w:proofErr w:type="spellEnd"/>
+            <w:r>
+              <w:t xml:space="preserve"> </w:t>
+            </w:r>
+            <w:proofErr w:type="spellStart"/>
+            <w:r>
+              <w:t>intre</w:t>
+            </w:r>
+            <w:proofErr w:type="spellEnd"/>
+            <w:r>
+              <w:t xml:space="preserve"> id </w:t>
+            </w:r>
+            <w:proofErr w:type="spellStart"/>
+            <w:r>
+              <w:t>uri</w:t>
+            </w:r>
+            <w:proofErr w:type="spellEnd"/>
+            <w:r>
+              <w:t xml:space="preserve"> sunt </w:t>
+            </w:r>
+            <w:proofErr w:type="spellStart"/>
+            <w:r>
+              <w:t>mai</w:t>
+            </w:r>
+            <w:proofErr w:type="spellEnd"/>
+            <w:r>
+              <w:t xml:space="preserve"> </w:t>
+            </w:r>
+            <w:proofErr w:type="spellStart"/>
+            <w:r>
+              <w:t>mici</w:t>
+            </w:r>
+            <w:proofErr w:type="spellEnd"/>
+          </w:p>
+        </w:tc>
+        <w:tc>
+          <w:tcPr>
+            <w:tcW w:w="4138" w:type="dxa"/>
+          </w:tcPr>
+          <w:p>
+            <w:pPr>
+              <w:pStyle w:val="ListParagraph"/>
+              <w:ind w:left="0"/>
+            </w:pPr>
+            <w:r>
+              <w:t xml:space="preserve">Se </w:t>
+            </w:r>
+            <w:proofErr w:type="spellStart"/>
+            <w:r>
+              <w:t>insereaza</w:t>
+            </w:r>
+            <w:proofErr w:type="spellEnd"/>
+            <w:r>
+              <w:t xml:space="preserve"> </w:t>
+            </w:r>
+            <w:r>
+              <w:t xml:space="preserve">rand cu rand </w:t>
+            </w:r>
+            <w:proofErr w:type="spellStart"/>
+            <w:r>
+              <w:t>pentru</w:t>
+            </w:r>
+            <w:proofErr w:type="spellEnd"/>
+            <w:r>
+              <w:t xml:space="preserve"> </w:t>
+            </w:r>
+            <w:proofErr w:type="gramStart"/>
+            <w:r>
+              <w:t>a</w:t>
+            </w:r>
+            <w:proofErr w:type="gramEnd"/>
+            <w:r>
+              <w:t xml:space="preserve"> </w:t>
+            </w:r>
+            <w:proofErr w:type="spellStart"/>
+            <w:r>
+              <w:t>afla</w:t>
+            </w:r>
+            <w:proofErr w:type="spellEnd"/>
+            <w:r>
+              <w:t xml:space="preserve"> </w:t>
+            </w:r>
+            <w:proofErr w:type="spellStart"/>
+            <w:r>
+              <w:t>urmatorul</w:t>
+            </w:r>
+            <w:proofErr w:type="spellEnd"/>
+            <w:r>
+              <w:t xml:space="preserve"> id </w:t>
+            </w:r>
+            <w:proofErr w:type="spellStart"/>
+            <w:r>
+              <w:t>generat</w:t>
+            </w:r>
+            <w:proofErr w:type="spellEnd"/>
+            <w:r>
+              <w:t xml:space="preserve"> </w:t>
+            </w:r>
+            <w:proofErr w:type="spellStart"/>
+            <w:r>
+              <w:t>scazand</w:t>
+            </w:r>
+            <w:proofErr w:type="spellEnd"/>
+            <w:r>
+              <w:t xml:space="preserve"> </w:t>
+            </w:r>
+            <w:proofErr w:type="spellStart"/>
+            <w:r>
+              <w:t>performanta</w:t>
+            </w:r>
+            <w:proofErr w:type="spellEnd"/>
+          </w:p>
+        </w:tc>
+      </w:tr>
+    </w:tbl>
+    <w:p>
+      <w:pPr>
+        <w:pStyle w:val="ListParagraph"/>
+      </w:pPr>
+    </w:p>
+    <w:p>
+      <w:r>
+        <w:t xml:space="preserve"> </w:t>
+      </w:r>
     </w:p>
     <w:sectPr>
       <w:pgSz w:w="12240" w:h="15840"/>
@@ -6401,6 +8568,155 @@
     </w:lvl>
   </w:abstractNum>
   <w:abstractNum w:abstractNumId="2" w15:restartNumberingAfterBreak="0">
+    <w:nsid w:val="4B216E64"/>
+    <w:multiLevelType w:val="multilevel"/>
+    <w:tmpl w:val="A6D23A78"/>
+    <w:lvl w:ilvl="0">
+      <w:start w:val="1"/>
+      <w:numFmt w:val="bullet"/>
+      <w:lvlText w:val=""/>
+      <w:lvlJc w:val="left"/>
+      <w:pPr>
+        <w:tabs>
+          <w:tab w:val="num" w:pos="720"/>
+        </w:tabs>
+        <w:ind w:left="720" w:hanging="360"/>
+      </w:pPr>
+      <w:rPr>
+        <w:rFonts w:ascii="Symbol" w:hAnsi="Symbol" w:hint="default"/>
+        <w:sz w:val="20"/>
+      </w:rPr>
+    </w:lvl>
+    <w:lvl w:ilvl="1" w:tentative="1">
+      <w:start w:val="1"/>
+      <w:numFmt w:val="bullet"/>
+      <w:lvlText w:val="o"/>
+      <w:lvlJc w:val="left"/>
+      <w:pPr>
+        <w:tabs>
+          <w:tab w:val="num" w:pos="1440"/>
+        </w:tabs>
+        <w:ind w:left="1440" w:hanging="360"/>
+      </w:pPr>
+      <w:rPr>
+        <w:rFonts w:ascii="Courier New" w:hAnsi="Courier New" w:hint="default"/>
+        <w:sz w:val="20"/>
+      </w:rPr>
+    </w:lvl>
+    <w:lvl w:ilvl="2" w:tentative="1">
+      <w:start w:val="1"/>
+      <w:numFmt w:val="bullet"/>
+      <w:lvlText w:val=""/>
+      <w:lvlJc w:val="left"/>
+      <w:pPr>
+        <w:tabs>
+          <w:tab w:val="num" w:pos="2160"/>
+        </w:tabs>
+        <w:ind w:left="2160" w:hanging="360"/>
+      </w:pPr>
+      <w:rPr>
+        <w:rFonts w:ascii="Wingdings" w:hAnsi="Wingdings" w:hint="default"/>
+        <w:sz w:val="20"/>
+      </w:rPr>
+    </w:lvl>
+    <w:lvl w:ilvl="3" w:tentative="1">
+      <w:start w:val="1"/>
+      <w:numFmt w:val="bullet"/>
+      <w:lvlText w:val=""/>
+      <w:lvlJc w:val="left"/>
+      <w:pPr>
+        <w:tabs>
+          <w:tab w:val="num" w:pos="2880"/>
+        </w:tabs>
+        <w:ind w:left="2880" w:hanging="360"/>
+      </w:pPr>
+      <w:rPr>
+        <w:rFonts w:ascii="Wingdings" w:hAnsi="Wingdings" w:hint="default"/>
+        <w:sz w:val="20"/>
+      </w:rPr>
+    </w:lvl>
+    <w:lvl w:ilvl="4" w:tentative="1">
+      <w:start w:val="1"/>
+      <w:numFmt w:val="bullet"/>
+      <w:lvlText w:val=""/>
+      <w:lvlJc w:val="left"/>
+      <w:pPr>
+        <w:tabs>
+          <w:tab w:val="num" w:pos="3600"/>
+        </w:tabs>
+        <w:ind w:left="3600" w:hanging="360"/>
+      </w:pPr>
+      <w:rPr>
+        <w:rFonts w:ascii="Wingdings" w:hAnsi="Wingdings" w:hint="default"/>
+        <w:sz w:val="20"/>
+      </w:rPr>
+    </w:lvl>
+    <w:lvl w:ilvl="5" w:tentative="1">
+      <w:start w:val="1"/>
+      <w:numFmt w:val="bullet"/>
+      <w:lvlText w:val=""/>
+      <w:lvlJc w:val="left"/>
+      <w:pPr>
+        <w:tabs>
+          <w:tab w:val="num" w:pos="4320"/>
+        </w:tabs>
+        <w:ind w:left="4320" w:hanging="360"/>
+      </w:pPr>
+      <w:rPr>
+        <w:rFonts w:ascii="Wingdings" w:hAnsi="Wingdings" w:hint="default"/>
+        <w:sz w:val="20"/>
+      </w:rPr>
+    </w:lvl>
+    <w:lvl w:ilvl="6" w:tentative="1">
+      <w:start w:val="1"/>
+      <w:numFmt w:val="bullet"/>
+      <w:lvlText w:val=""/>
+      <w:lvlJc w:val="left"/>
+      <w:pPr>
+        <w:tabs>
+          <w:tab w:val="num" w:pos="5040"/>
+        </w:tabs>
+        <w:ind w:left="5040" w:hanging="360"/>
+      </w:pPr>
+      <w:rPr>
+        <w:rFonts w:ascii="Wingdings" w:hAnsi="Wingdings" w:hint="default"/>
+        <w:sz w:val="20"/>
+      </w:rPr>
+    </w:lvl>
+    <w:lvl w:ilvl="7" w:tentative="1">
+      <w:start w:val="1"/>
+      <w:numFmt w:val="bullet"/>
+      <w:lvlText w:val=""/>
+      <w:lvlJc w:val="left"/>
+      <w:pPr>
+        <w:tabs>
+          <w:tab w:val="num" w:pos="5760"/>
+        </w:tabs>
+        <w:ind w:left="5760" w:hanging="360"/>
+      </w:pPr>
+      <w:rPr>
+        <w:rFonts w:ascii="Wingdings" w:hAnsi="Wingdings" w:hint="default"/>
+        <w:sz w:val="20"/>
+      </w:rPr>
+    </w:lvl>
+    <w:lvl w:ilvl="8" w:tentative="1">
+      <w:start w:val="1"/>
+      <w:numFmt w:val="bullet"/>
+      <w:lvlText w:val=""/>
+      <w:lvlJc w:val="left"/>
+      <w:pPr>
+        <w:tabs>
+          <w:tab w:val="num" w:pos="6480"/>
+        </w:tabs>
+        <w:ind w:left="6480" w:hanging="360"/>
+      </w:pPr>
+      <w:rPr>
+        <w:rFonts w:ascii="Wingdings" w:hAnsi="Wingdings" w:hint="default"/>
+        <w:sz w:val="20"/>
+      </w:rPr>
+    </w:lvl>
+  </w:abstractNum>
+  <w:abstractNum w:abstractNumId="3" w15:restartNumberingAfterBreak="0">
     <w:nsid w:val="52FC4D71"/>
     <w:multiLevelType w:val="hybridMultilevel"/>
     <w:tmpl w:val="7AE8AE2A"/>
@@ -6486,7 +8802,7 @@
       </w:pPr>
     </w:lvl>
   </w:abstractNum>
-  <w:abstractNum w:abstractNumId="3" w15:restartNumberingAfterBreak="0">
+  <w:abstractNum w:abstractNumId="4" w15:restartNumberingAfterBreak="0">
     <w:nsid w:val="559916DF"/>
     <w:multiLevelType w:val="hybridMultilevel"/>
     <w:tmpl w:val="07B4C85E"/>
@@ -6599,7 +8915,7 @@
       </w:rPr>
     </w:lvl>
   </w:abstractNum>
-  <w:abstractNum w:abstractNumId="4" w15:restartNumberingAfterBreak="0">
+  <w:abstractNum w:abstractNumId="5" w15:restartNumberingAfterBreak="0">
     <w:nsid w:val="5C144434"/>
     <w:multiLevelType w:val="multilevel"/>
     <w:tmpl w:val="7228ECBC"/>
@@ -6748,7 +9064,7 @@
       </w:rPr>
     </w:lvl>
   </w:abstractNum>
-  <w:abstractNum w:abstractNumId="5" w15:restartNumberingAfterBreak="0">
+  <w:abstractNum w:abstractNumId="6" w15:restartNumberingAfterBreak="0">
     <w:nsid w:val="667E43E7"/>
     <w:multiLevelType w:val="hybridMultilevel"/>
     <w:tmpl w:val="4CE0AEEA"/>
@@ -6865,19 +9181,22 @@
     <w:abstractNumId w:val="1"/>
   </w:num>
   <w:num w:numId="2" w16cid:durableId="848102966">
-    <w:abstractNumId w:val="5"/>
+    <w:abstractNumId w:val="6"/>
   </w:num>
   <w:num w:numId="3" w16cid:durableId="1175221038">
     <w:abstractNumId w:val="0"/>
   </w:num>
   <w:num w:numId="4" w16cid:durableId="2096322837">
+    <w:abstractNumId w:val="4"/>
+  </w:num>
+  <w:num w:numId="5" w16cid:durableId="1654676127">
     <w:abstractNumId w:val="3"/>
   </w:num>
-  <w:num w:numId="5" w16cid:durableId="1654676127">
+  <w:num w:numId="6" w16cid:durableId="1105883535">
+    <w:abstractNumId w:val="5"/>
+  </w:num>
+  <w:num w:numId="7" w16cid:durableId="1177497526">
     <w:abstractNumId w:val="2"/>
-  </w:num>
-  <w:num w:numId="6" w16cid:durableId="1105883535">
-    <w:abstractNumId w:val="4"/>
   </w:num>
 </w:numbering>
 </file>
@@ -7875,6 +10194,25 @@
       <w:ind w:left="240"/>
     </w:pPr>
   </w:style>
+  <w:style w:type="table" w:styleId="TableGrid">
+    <w:name w:val="Table Grid"/>
+    <w:basedOn w:val="TableNormal"/>
+    <w:uiPriority w:val="39"/>
+    <w:rsid w:val="00226F02"/>
+    <w:pPr>
+      <w:spacing w:after="0" w:line="240" w:lineRule="auto"/>
+    </w:pPr>
+    <w:tblPr>
+      <w:tblBorders>
+        <w:top w:val="single" w:sz="4" w:space="0" w:color="auto"/>
+        <w:left w:val="single" w:sz="4" w:space="0" w:color="auto"/>
+        <w:bottom w:val="single" w:sz="4" w:space="0" w:color="auto"/>
+        <w:right w:val="single" w:sz="4" w:space="0" w:color="auto"/>
+        <w:insideH w:val="single" w:sz="4" w:space="0" w:color="auto"/>
+        <w:insideV w:val="single" w:sz="4" w:space="0" w:color="auto"/>
+      </w:tblBorders>
+    </w:tblPr>
+  </w:style>
 </w:styles>
 </file>
 

</xml_diff>